<commit_message>
Commit outstanding work in the 16 September 2026 clean up
</commit_message>
<xml_diff>
--- a/01.manuscript/Supporting Information.docx
+++ b/01.manuscript/Supporting Information.docx
@@ -2937,12 +2937,12 @@
         <w:tblLayout w:type="fixed"/>
       </w:tblPr>
       <w:tblGrid>
-        <w:gridCol w:w="3939"/>
-        <w:gridCol w:w="820"/>
-        <w:gridCol w:w="1231"/>
-        <w:gridCol w:w="1067"/>
-        <w:gridCol w:w="1477"/>
-        <w:gridCol w:w="820"/>
+        <w:gridCol w:w="3185"/>
+        <w:gridCol w:w="2455"/>
+        <w:gridCol w:w="995"/>
+        <w:gridCol w:w="862"/>
+        <w:gridCol w:w="1194"/>
+        <w:gridCol w:w="663"/>
       </w:tblGrid>
       <w:tr>
         <w:trPr>
@@ -2951,7 +2951,7 @@
         </w:trPr>
         <w:tc>
           <w:tcPr>
-            <w:tcW w:w="3939" w:type="dxa"/>
+            <w:tcW w:w="3185" w:type="dxa"/>
           </w:tcPr>
           <w:p>
             <w:pPr>
@@ -2973,7 +2973,7 @@
         </w:tc>
         <w:tc>
           <w:tcPr>
-            <w:tcW w:w="820" w:type="dxa"/>
+            <w:tcW w:w="2455" w:type="dxa"/>
           </w:tcPr>
           <w:p>
             <w:pPr>
@@ -2995,7 +2995,7 @@
         </w:tc>
         <w:tc>
           <w:tcPr>
-            <w:tcW w:w="1231" w:type="dxa"/>
+            <w:tcW w:w="995" w:type="dxa"/>
           </w:tcPr>
           <w:p>
             <w:pPr>
@@ -3017,7 +3017,7 @@
         </w:tc>
         <w:tc>
           <w:tcPr>
-            <w:tcW w:w="1067" w:type="dxa"/>
+            <w:tcW w:w="862" w:type="dxa"/>
           </w:tcPr>
           <w:p>
             <w:pPr>
@@ -3039,7 +3039,7 @@
         </w:tc>
         <w:tc>
           <w:tcPr>
-            <w:tcW w:w="1477" w:type="dxa"/>
+            <w:tcW w:w="1194" w:type="dxa"/>
           </w:tcPr>
           <w:p>
             <w:pPr>
@@ -3061,7 +3061,7 @@
         </w:tc>
         <w:tc>
           <w:tcPr>
-            <w:tcW w:w="820" w:type="dxa"/>
+            <w:tcW w:w="663" w:type="dxa"/>
           </w:tcPr>
           <w:p>
             <w:pPr>
@@ -3088,7 +3088,7 @@
         </w:trPr>
         <w:tc>
           <w:tcPr>
-            <w:tcW w:w="3939" w:type="dxa"/>
+            <w:tcW w:w="3185" w:type="dxa"/>
           </w:tcPr>
           <w:p>
             <w:pPr>
@@ -3110,29 +3110,29 @@
         </w:tc>
         <w:tc>
           <w:tcPr>
-            <w:tcW w:w="820" w:type="dxa"/>
-          </w:tcPr>
-          <w:p>
-            <w:pPr>
-              <w:pStyle w:val="Compact"/>
-              <w:jc w:val="left"/>
-              <w:rPr>
-                <w:sz w:val="16"/>
-                <w:szCs w:val="16"/>
-              </w:rPr>
-            </w:pPr>
-            <w:r>
-              <w:rPr>
-                <w:sz w:val="16"/>
-                <w:szCs w:val="16"/>
-              </w:rPr>
-              <w:t xml:space="preserve">landform</w:t>
-            </w:r>
-          </w:p>
-        </w:tc>
-        <w:tc>
-          <w:tcPr>
-            <w:tcW w:w="1231" w:type="dxa"/>
+            <w:tcW w:w="2455" w:type="dxa"/>
+          </w:tcPr>
+          <w:p>
+            <w:pPr>
+              <w:pStyle w:val="Compact"/>
+              <w:jc w:val="left"/>
+              <w:rPr>
+                <w:sz w:val="16"/>
+                <w:szCs w:val="16"/>
+              </w:rPr>
+            </w:pPr>
+            <w:r>
+              <w:rPr>
+                <w:sz w:val="16"/>
+                <w:szCs w:val="16"/>
+              </w:rPr>
+              <w:t xml:space="preserve">Landform</w:t>
+            </w:r>
+          </w:p>
+        </w:tc>
+        <w:tc>
+          <w:tcPr>
+            <w:tcW w:w="995" w:type="dxa"/>
           </w:tcPr>
           <w:p>
             <w:pPr>
@@ -3154,7 +3154,7 @@
         </w:tc>
         <w:tc>
           <w:tcPr>
-            <w:tcW w:w="1067" w:type="dxa"/>
+            <w:tcW w:w="862" w:type="dxa"/>
           </w:tcPr>
           <w:p>
             <w:pPr>
@@ -3176,7 +3176,7 @@
         </w:tc>
         <w:tc>
           <w:tcPr>
-            <w:tcW w:w="1477" w:type="dxa"/>
+            <w:tcW w:w="1194" w:type="dxa"/>
           </w:tcPr>
           <w:p>
             <w:pPr>
@@ -3198,7 +3198,7 @@
         </w:tc>
         <w:tc>
           <w:tcPr>
-            <w:tcW w:w="820" w:type="dxa"/>
+            <w:tcW w:w="663" w:type="dxa"/>
           </w:tcPr>
           <w:p>
             <w:pPr>
@@ -3225,7 +3225,7 @@
         </w:trPr>
         <w:tc>
           <w:tcPr>
-            <w:tcW w:w="3939" w:type="dxa"/>
+            <w:tcW w:w="3185" w:type="dxa"/>
           </w:tcPr>
           <w:p>
             <w:pPr>
@@ -3247,29 +3247,29 @@
         </w:tc>
         <w:tc>
           <w:tcPr>
-            <w:tcW w:w="820" w:type="dxa"/>
-          </w:tcPr>
-          <w:p>
-            <w:pPr>
-              <w:pStyle w:val="Compact"/>
-              <w:jc w:val="left"/>
-              <w:rPr>
-                <w:sz w:val="16"/>
-                <w:szCs w:val="16"/>
-              </w:rPr>
-            </w:pPr>
-            <w:r>
-              <w:rPr>
-                <w:sz w:val="16"/>
-                <w:szCs w:val="16"/>
-              </w:rPr>
-              <w:t xml:space="preserve">hostsize</w:t>
-            </w:r>
-          </w:p>
-        </w:tc>
-        <w:tc>
-          <w:tcPr>
-            <w:tcW w:w="1231" w:type="dxa"/>
+            <w:tcW w:w="2455" w:type="dxa"/>
+          </w:tcPr>
+          <w:p>
+            <w:pPr>
+              <w:pStyle w:val="Compact"/>
+              <w:jc w:val="left"/>
+              <w:rPr>
+                <w:sz w:val="16"/>
+                <w:szCs w:val="16"/>
+              </w:rPr>
+            </w:pPr>
+            <w:r>
+              <w:rPr>
+                <w:sz w:val="16"/>
+                <w:szCs w:val="16"/>
+              </w:rPr>
+              <w:t xml:space="preserve">Host size</w:t>
+            </w:r>
+          </w:p>
+        </w:tc>
+        <w:tc>
+          <w:tcPr>
+            <w:tcW w:w="995" w:type="dxa"/>
           </w:tcPr>
           <w:p>
             <w:pPr>
@@ -3291,7 +3291,7 @@
         </w:tc>
         <w:tc>
           <w:tcPr>
-            <w:tcW w:w="1067" w:type="dxa"/>
+            <w:tcW w:w="862" w:type="dxa"/>
           </w:tcPr>
           <w:p>
             <w:pPr>
@@ -3313,7 +3313,7 @@
         </w:tc>
         <w:tc>
           <w:tcPr>
-            <w:tcW w:w="1477" w:type="dxa"/>
+            <w:tcW w:w="1194" w:type="dxa"/>
           </w:tcPr>
           <w:p>
             <w:pPr>
@@ -3335,7 +3335,7 @@
         </w:tc>
         <w:tc>
           <w:tcPr>
-            <w:tcW w:w="820" w:type="dxa"/>
+            <w:tcW w:w="663" w:type="dxa"/>
           </w:tcPr>
           <w:p>
             <w:pPr>
@@ -3362,7 +3362,7 @@
         </w:trPr>
         <w:tc>
           <w:tcPr>
-            <w:tcW w:w="3939" w:type="dxa"/>
+            <w:tcW w:w="3185" w:type="dxa"/>
           </w:tcPr>
           <w:p>
             <w:pPr>
@@ -3384,29 +3384,29 @@
         </w:tc>
         <w:tc>
           <w:tcPr>
-            <w:tcW w:w="820" w:type="dxa"/>
-          </w:tcPr>
-          <w:p>
-            <w:pPr>
-              <w:pStyle w:val="Compact"/>
-              <w:jc w:val="left"/>
-              <w:rPr>
-                <w:sz w:val="16"/>
-                <w:szCs w:val="16"/>
-              </w:rPr>
-            </w:pPr>
-            <w:r>
-              <w:rPr>
-                <w:sz w:val="16"/>
-                <w:szCs w:val="16"/>
-              </w:rPr>
-              <w:t xml:space="preserve">density</w:t>
-            </w:r>
-          </w:p>
-        </w:tc>
-        <w:tc>
-          <w:tcPr>
-            <w:tcW w:w="1231" w:type="dxa"/>
+            <w:tcW w:w="2455" w:type="dxa"/>
+          </w:tcPr>
+          <w:p>
+            <w:pPr>
+              <w:pStyle w:val="Compact"/>
+              <w:jc w:val="left"/>
+              <w:rPr>
+                <w:sz w:val="16"/>
+                <w:szCs w:val="16"/>
+              </w:rPr>
+            </w:pPr>
+            <w:r>
+              <w:rPr>
+                <w:sz w:val="16"/>
+                <w:szCs w:val="16"/>
+              </w:rPr>
+              <w:t xml:space="preserve">Stand density</w:t>
+            </w:r>
+          </w:p>
+        </w:tc>
+        <w:tc>
+          <w:tcPr>
+            <w:tcW w:w="995" w:type="dxa"/>
           </w:tcPr>
           <w:p>
             <w:pPr>
@@ -3428,7 +3428,7 @@
         </w:tc>
         <w:tc>
           <w:tcPr>
-            <w:tcW w:w="1067" w:type="dxa"/>
+            <w:tcW w:w="862" w:type="dxa"/>
           </w:tcPr>
           <w:p>
             <w:pPr>
@@ -3450,7 +3450,7 @@
         </w:tc>
         <w:tc>
           <w:tcPr>
-            <w:tcW w:w="1477" w:type="dxa"/>
+            <w:tcW w:w="1194" w:type="dxa"/>
           </w:tcPr>
           <w:p>
             <w:pPr>
@@ -3472,7 +3472,7 @@
         </w:tc>
         <w:tc>
           <w:tcPr>
-            <w:tcW w:w="820" w:type="dxa"/>
+            <w:tcW w:w="663" w:type="dxa"/>
           </w:tcPr>
           <w:p>
             <w:pPr>
@@ -3499,7 +3499,7 @@
         </w:trPr>
         <w:tc>
           <w:tcPr>
-            <w:tcW w:w="3939" w:type="dxa"/>
+            <w:tcW w:w="3185" w:type="dxa"/>
           </w:tcPr>
           <w:p>
             <w:pPr>
@@ -3521,29 +3521,29 @@
         </w:tc>
         <w:tc>
           <w:tcPr>
-            <w:tcW w:w="820" w:type="dxa"/>
-          </w:tcPr>
-          <w:p>
-            <w:pPr>
-              <w:pStyle w:val="Compact"/>
-              <w:jc w:val="left"/>
-              <w:rPr>
-                <w:sz w:val="16"/>
-                <w:szCs w:val="16"/>
-              </w:rPr>
-            </w:pPr>
-            <w:r>
-              <w:rPr>
-                <w:sz w:val="16"/>
-                <w:szCs w:val="16"/>
-              </w:rPr>
-              <w:t xml:space="preserve">shading</w:t>
-            </w:r>
-          </w:p>
-        </w:tc>
-        <w:tc>
-          <w:tcPr>
-            <w:tcW w:w="1231" w:type="dxa"/>
+            <w:tcW w:w="2455" w:type="dxa"/>
+          </w:tcPr>
+          <w:p>
+            <w:pPr>
+              <w:pStyle w:val="Compact"/>
+              <w:jc w:val="left"/>
+              <w:rPr>
+                <w:sz w:val="16"/>
+                <w:szCs w:val="16"/>
+              </w:rPr>
+            </w:pPr>
+            <w:r>
+              <w:rPr>
+                <w:sz w:val="16"/>
+                <w:szCs w:val="16"/>
+              </w:rPr>
+              <w:t xml:space="preserve">Topographic shading</w:t>
+            </w:r>
+          </w:p>
+        </w:tc>
+        <w:tc>
+          <w:tcPr>
+            <w:tcW w:w="995" w:type="dxa"/>
           </w:tcPr>
           <w:p>
             <w:pPr>
@@ -3565,7 +3565,7 @@
         </w:tc>
         <w:tc>
           <w:tcPr>
-            <w:tcW w:w="1067" w:type="dxa"/>
+            <w:tcW w:w="862" w:type="dxa"/>
           </w:tcPr>
           <w:p>
             <w:pPr>
@@ -3587,7 +3587,7 @@
         </w:tc>
         <w:tc>
           <w:tcPr>
-            <w:tcW w:w="1477" w:type="dxa"/>
+            <w:tcW w:w="1194" w:type="dxa"/>
           </w:tcPr>
           <w:p>
             <w:pPr>
@@ -3609,7 +3609,7 @@
         </w:tc>
         <w:tc>
           <w:tcPr>
-            <w:tcW w:w="820" w:type="dxa"/>
+            <w:tcW w:w="663" w:type="dxa"/>
           </w:tcPr>
           <w:p>
             <w:pPr>
@@ -3636,7 +3636,7 @@
         </w:trPr>
         <w:tc>
           <w:tcPr>
-            <w:tcW w:w="3939" w:type="dxa"/>
+            <w:tcW w:w="3185" w:type="dxa"/>
           </w:tcPr>
           <w:p>
             <w:pPr>
@@ -3658,29 +3658,29 @@
         </w:tc>
         <w:tc>
           <w:tcPr>
-            <w:tcW w:w="820" w:type="dxa"/>
-          </w:tcPr>
-          <w:p>
-            <w:pPr>
-              <w:pStyle w:val="Compact"/>
-              <w:jc w:val="left"/>
-              <w:rPr>
-                <w:sz w:val="16"/>
-                <w:szCs w:val="16"/>
-              </w:rPr>
-            </w:pPr>
-            <w:r>
-              <w:rPr>
-                <w:sz w:val="16"/>
-                <w:szCs w:val="16"/>
-              </w:rPr>
-              <w:t xml:space="preserve">hostsize</w:t>
-            </w:r>
-          </w:p>
-        </w:tc>
-        <w:tc>
-          <w:tcPr>
-            <w:tcW w:w="1231" w:type="dxa"/>
+            <w:tcW w:w="2455" w:type="dxa"/>
+          </w:tcPr>
+          <w:p>
+            <w:pPr>
+              <w:pStyle w:val="Compact"/>
+              <w:jc w:val="left"/>
+              <w:rPr>
+                <w:sz w:val="16"/>
+                <w:szCs w:val="16"/>
+              </w:rPr>
+            </w:pPr>
+            <w:r>
+              <w:rPr>
+                <w:sz w:val="16"/>
+                <w:szCs w:val="16"/>
+              </w:rPr>
+              <w:t xml:space="preserve">Host size</w:t>
+            </w:r>
+          </w:p>
+        </w:tc>
+        <w:tc>
+          <w:tcPr>
+            <w:tcW w:w="995" w:type="dxa"/>
           </w:tcPr>
           <w:p>
             <w:pPr>
@@ -3702,7 +3702,7 @@
         </w:tc>
         <w:tc>
           <w:tcPr>
-            <w:tcW w:w="1067" w:type="dxa"/>
+            <w:tcW w:w="862" w:type="dxa"/>
           </w:tcPr>
           <w:p>
             <w:pPr>
@@ -3724,7 +3724,7 @@
         </w:tc>
         <w:tc>
           <w:tcPr>
-            <w:tcW w:w="1477" w:type="dxa"/>
+            <w:tcW w:w="1194" w:type="dxa"/>
           </w:tcPr>
           <w:p>
             <w:pPr>
@@ -3746,7 +3746,7 @@
         </w:tc>
         <w:tc>
           <w:tcPr>
-            <w:tcW w:w="820" w:type="dxa"/>
+            <w:tcW w:w="663" w:type="dxa"/>
           </w:tcPr>
           <w:p>
             <w:pPr>
@@ -3766,7 +3766,7 @@
         </w:trPr>
         <w:tc>
           <w:tcPr>
-            <w:tcW w:w="3939" w:type="dxa"/>
+            <w:tcW w:w="3185" w:type="dxa"/>
           </w:tcPr>
           <w:p>
             <w:pPr>
@@ -3788,29 +3788,29 @@
         </w:tc>
         <w:tc>
           <w:tcPr>
-            <w:tcW w:w="820" w:type="dxa"/>
-          </w:tcPr>
-          <w:p>
-            <w:pPr>
-              <w:pStyle w:val="Compact"/>
-              <w:jc w:val="left"/>
-              <w:rPr>
-                <w:sz w:val="16"/>
-                <w:szCs w:val="16"/>
-              </w:rPr>
-            </w:pPr>
-            <w:r>
-              <w:rPr>
-                <w:sz w:val="16"/>
-                <w:szCs w:val="16"/>
-              </w:rPr>
-              <w:t xml:space="preserve">wind_t</w:t>
-            </w:r>
-          </w:p>
-        </w:tc>
-        <w:tc>
-          <w:tcPr>
-            <w:tcW w:w="1231" w:type="dxa"/>
+            <w:tcW w:w="2455" w:type="dxa"/>
+          </w:tcPr>
+          <w:p>
+            <w:pPr>
+              <w:pStyle w:val="Compact"/>
+              <w:jc w:val="left"/>
+              <w:rPr>
+                <w:sz w:val="16"/>
+                <w:szCs w:val="16"/>
+              </w:rPr>
+            </w:pPr>
+            <w:r>
+              <w:rPr>
+                <w:sz w:val="16"/>
+                <w:szCs w:val="16"/>
+              </w:rPr>
+              <w:t xml:space="preserve">Flight-window wind, stations</w:t>
+            </w:r>
+          </w:p>
+        </w:tc>
+        <w:tc>
+          <w:tcPr>
+            <w:tcW w:w="995" w:type="dxa"/>
           </w:tcPr>
           <w:p>
             <w:pPr>
@@ -3832,7 +3832,7 @@
         </w:tc>
         <w:tc>
           <w:tcPr>
-            <w:tcW w:w="1067" w:type="dxa"/>
+            <w:tcW w:w="862" w:type="dxa"/>
           </w:tcPr>
           <w:p>
             <w:pPr>
@@ -3854,7 +3854,7 @@
         </w:tc>
         <w:tc>
           <w:tcPr>
-            <w:tcW w:w="1477" w:type="dxa"/>
+            <w:tcW w:w="1194" w:type="dxa"/>
           </w:tcPr>
           <w:p>
             <w:pPr>
@@ -3876,7 +3876,7 @@
         </w:tc>
         <w:tc>
           <w:tcPr>
-            <w:tcW w:w="820" w:type="dxa"/>
+            <w:tcW w:w="663" w:type="dxa"/>
           </w:tcPr>
           <w:p>
             <w:pPr>
@@ -3903,7 +3903,7 @@
         </w:trPr>
         <w:tc>
           <w:tcPr>
-            <w:tcW w:w="3939" w:type="dxa"/>
+            <w:tcW w:w="3185" w:type="dxa"/>
           </w:tcPr>
           <w:p>
             <w:pPr>
@@ -3925,29 +3925,29 @@
         </w:tc>
         <w:tc>
           <w:tcPr>
-            <w:tcW w:w="820" w:type="dxa"/>
-          </w:tcPr>
-          <w:p>
-            <w:pPr>
-              <w:pStyle w:val="Compact"/>
-              <w:jc w:val="left"/>
-              <w:rPr>
-                <w:sz w:val="16"/>
-                <w:szCs w:val="16"/>
-              </w:rPr>
-            </w:pPr>
-            <w:r>
-              <w:rPr>
-                <w:sz w:val="16"/>
-                <w:szCs w:val="16"/>
-              </w:rPr>
-              <w:t xml:space="preserve">shading</w:t>
-            </w:r>
-          </w:p>
-        </w:tc>
-        <w:tc>
-          <w:tcPr>
-            <w:tcW w:w="1231" w:type="dxa"/>
+            <w:tcW w:w="2455" w:type="dxa"/>
+          </w:tcPr>
+          <w:p>
+            <w:pPr>
+              <w:pStyle w:val="Compact"/>
+              <w:jc w:val="left"/>
+              <w:rPr>
+                <w:sz w:val="16"/>
+                <w:szCs w:val="16"/>
+              </w:rPr>
+            </w:pPr>
+            <w:r>
+              <w:rPr>
+                <w:sz w:val="16"/>
+                <w:szCs w:val="16"/>
+              </w:rPr>
+              <w:t xml:space="preserve">Topographic shading</w:t>
+            </w:r>
+          </w:p>
+        </w:tc>
+        <w:tc>
+          <w:tcPr>
+            <w:tcW w:w="995" w:type="dxa"/>
           </w:tcPr>
           <w:p>
             <w:pPr>
@@ -3969,7 +3969,7 @@
         </w:tc>
         <w:tc>
           <w:tcPr>
-            <w:tcW w:w="1067" w:type="dxa"/>
+            <w:tcW w:w="862" w:type="dxa"/>
           </w:tcPr>
           <w:p>
             <w:pPr>
@@ -3991,7 +3991,7 @@
         </w:tc>
         <w:tc>
           <w:tcPr>
-            <w:tcW w:w="1477" w:type="dxa"/>
+            <w:tcW w:w="1194" w:type="dxa"/>
           </w:tcPr>
           <w:p>
             <w:pPr>
@@ -4013,7 +4013,7 @@
         </w:tc>
         <w:tc>
           <w:tcPr>
-            <w:tcW w:w="820" w:type="dxa"/>
+            <w:tcW w:w="663" w:type="dxa"/>
           </w:tcPr>
           <w:p>
             <w:pPr>
@@ -4033,7 +4033,7 @@
         </w:trPr>
         <w:tc>
           <w:tcPr>
-            <w:tcW w:w="3939" w:type="dxa"/>
+            <w:tcW w:w="3185" w:type="dxa"/>
           </w:tcPr>
           <w:p>
             <w:pPr>
@@ -4055,29 +4055,29 @@
         </w:tc>
         <w:tc>
           <w:tcPr>
-            <w:tcW w:w="820" w:type="dxa"/>
-          </w:tcPr>
-          <w:p>
-            <w:pPr>
-              <w:pStyle w:val="Compact"/>
-              <w:jc w:val="left"/>
-              <w:rPr>
-                <w:sz w:val="16"/>
-                <w:szCs w:val="16"/>
-              </w:rPr>
-            </w:pPr>
-            <w:r>
-              <w:rPr>
-                <w:sz w:val="16"/>
-                <w:szCs w:val="16"/>
-              </w:rPr>
-              <w:t xml:space="preserve">hostsize</w:t>
-            </w:r>
-          </w:p>
-        </w:tc>
-        <w:tc>
-          <w:tcPr>
-            <w:tcW w:w="1231" w:type="dxa"/>
+            <w:tcW w:w="2455" w:type="dxa"/>
+          </w:tcPr>
+          <w:p>
+            <w:pPr>
+              <w:pStyle w:val="Compact"/>
+              <w:jc w:val="left"/>
+              <w:rPr>
+                <w:sz w:val="16"/>
+                <w:szCs w:val="16"/>
+              </w:rPr>
+            </w:pPr>
+            <w:r>
+              <w:rPr>
+                <w:sz w:val="16"/>
+                <w:szCs w:val="16"/>
+              </w:rPr>
+              <w:t xml:space="preserve">Host size</w:t>
+            </w:r>
+          </w:p>
+        </w:tc>
+        <w:tc>
+          <w:tcPr>
+            <w:tcW w:w="995" w:type="dxa"/>
           </w:tcPr>
           <w:p>
             <w:pPr>
@@ -4099,7 +4099,7 @@
         </w:tc>
         <w:tc>
           <w:tcPr>
-            <w:tcW w:w="1067" w:type="dxa"/>
+            <w:tcW w:w="862" w:type="dxa"/>
           </w:tcPr>
           <w:p>
             <w:pPr>
@@ -4121,7 +4121,7 @@
         </w:tc>
         <w:tc>
           <w:tcPr>
-            <w:tcW w:w="1477" w:type="dxa"/>
+            <w:tcW w:w="1194" w:type="dxa"/>
           </w:tcPr>
           <w:p>
             <w:pPr>
@@ -4143,7 +4143,7 @@
         </w:tc>
         <w:tc>
           <w:tcPr>
-            <w:tcW w:w="820" w:type="dxa"/>
+            <w:tcW w:w="663" w:type="dxa"/>
           </w:tcPr>
           <w:p>
             <w:pPr>
@@ -4163,7 +4163,7 @@
         </w:trPr>
         <w:tc>
           <w:tcPr>
-            <w:tcW w:w="3939" w:type="dxa"/>
+            <w:tcW w:w="3185" w:type="dxa"/>
           </w:tcPr>
           <w:p>
             <w:pPr>
@@ -4185,29 +4185,29 @@
         </w:tc>
         <w:tc>
           <w:tcPr>
-            <w:tcW w:w="820" w:type="dxa"/>
-          </w:tcPr>
-          <w:p>
-            <w:pPr>
-              <w:pStyle w:val="Compact"/>
-              <w:jc w:val="left"/>
-              <w:rPr>
-                <w:sz w:val="16"/>
-                <w:szCs w:val="16"/>
-              </w:rPr>
-            </w:pPr>
-            <w:r>
-              <w:rPr>
-                <w:sz w:val="16"/>
-                <w:szCs w:val="16"/>
-              </w:rPr>
-              <w:t xml:space="preserve">wind_t</w:t>
-            </w:r>
-          </w:p>
-        </w:tc>
-        <w:tc>
-          <w:tcPr>
-            <w:tcW w:w="1231" w:type="dxa"/>
+            <w:tcW w:w="2455" w:type="dxa"/>
+          </w:tcPr>
+          <w:p>
+            <w:pPr>
+              <w:pStyle w:val="Compact"/>
+              <w:jc w:val="left"/>
+              <w:rPr>
+                <w:sz w:val="16"/>
+                <w:szCs w:val="16"/>
+              </w:rPr>
+            </w:pPr>
+            <w:r>
+              <w:rPr>
+                <w:sz w:val="16"/>
+                <w:szCs w:val="16"/>
+              </w:rPr>
+              <w:t xml:space="preserve">Flight-window wind, stations</w:t>
+            </w:r>
+          </w:p>
+        </w:tc>
+        <w:tc>
+          <w:tcPr>
+            <w:tcW w:w="995" w:type="dxa"/>
           </w:tcPr>
           <w:p>
             <w:pPr>
@@ -4229,7 +4229,7 @@
         </w:tc>
         <w:tc>
           <w:tcPr>
-            <w:tcW w:w="1067" w:type="dxa"/>
+            <w:tcW w:w="862" w:type="dxa"/>
           </w:tcPr>
           <w:p>
             <w:pPr>
@@ -4251,7 +4251,7 @@
         </w:tc>
         <w:tc>
           <w:tcPr>
-            <w:tcW w:w="1477" w:type="dxa"/>
+            <w:tcW w:w="1194" w:type="dxa"/>
           </w:tcPr>
           <w:p>
             <w:pPr>
@@ -4273,7 +4273,7 @@
         </w:tc>
         <w:tc>
           <w:tcPr>
-            <w:tcW w:w="820" w:type="dxa"/>
+            <w:tcW w:w="663" w:type="dxa"/>
           </w:tcPr>
           <w:p>
             <w:pPr>
@@ -4293,7 +4293,7 @@
         </w:trPr>
         <w:tc>
           <w:tcPr>
-            <w:tcW w:w="3939" w:type="dxa"/>
+            <w:tcW w:w="3185" w:type="dxa"/>
           </w:tcPr>
           <w:p>
             <w:pPr>
@@ -4315,29 +4315,29 @@
         </w:tc>
         <w:tc>
           <w:tcPr>
-            <w:tcW w:w="820" w:type="dxa"/>
-          </w:tcPr>
-          <w:p>
-            <w:pPr>
-              <w:pStyle w:val="Compact"/>
-              <w:jc w:val="left"/>
-              <w:rPr>
-                <w:sz w:val="16"/>
-                <w:szCs w:val="16"/>
-              </w:rPr>
-            </w:pPr>
-            <w:r>
-              <w:rPr>
-                <w:sz w:val="16"/>
-                <w:szCs w:val="16"/>
-              </w:rPr>
-              <w:t xml:space="preserve">wind_geo</w:t>
-            </w:r>
-          </w:p>
-        </w:tc>
-        <w:tc>
-          <w:tcPr>
-            <w:tcW w:w="1231" w:type="dxa"/>
+            <w:tcW w:w="2455" w:type="dxa"/>
+          </w:tcPr>
+          <w:p>
+            <w:pPr>
+              <w:pStyle w:val="Compact"/>
+              <w:jc w:val="left"/>
+              <w:rPr>
+                <w:sz w:val="16"/>
+                <w:szCs w:val="16"/>
+              </w:rPr>
+            </w:pPr>
+            <w:r>
+              <w:rPr>
+                <w:sz w:val="16"/>
+                <w:szCs w:val="16"/>
+              </w:rPr>
+              <w:t xml:space="preserve">Terrain exposure to wind</w:t>
+            </w:r>
+          </w:p>
+        </w:tc>
+        <w:tc>
+          <w:tcPr>
+            <w:tcW w:w="995" w:type="dxa"/>
           </w:tcPr>
           <w:p>
             <w:pPr>
@@ -4359,7 +4359,7 @@
         </w:tc>
         <w:tc>
           <w:tcPr>
-            <w:tcW w:w="1067" w:type="dxa"/>
+            <w:tcW w:w="862" w:type="dxa"/>
           </w:tcPr>
           <w:p>
             <w:pPr>
@@ -4381,7 +4381,7 @@
         </w:tc>
         <w:tc>
           <w:tcPr>
-            <w:tcW w:w="1477" w:type="dxa"/>
+            <w:tcW w:w="1194" w:type="dxa"/>
           </w:tcPr>
           <w:p>
             <w:pPr>
@@ -4403,7 +4403,7 @@
         </w:tc>
         <w:tc>
           <w:tcPr>
-            <w:tcW w:w="820" w:type="dxa"/>
+            <w:tcW w:w="663" w:type="dxa"/>
           </w:tcPr>
           <w:p>
             <w:pPr>
@@ -4430,7 +4430,7 @@
         </w:trPr>
         <w:tc>
           <w:tcPr>
-            <w:tcW w:w="3939" w:type="dxa"/>
+            <w:tcW w:w="3185" w:type="dxa"/>
           </w:tcPr>
           <w:p>
             <w:pPr>
@@ -4452,29 +4452,29 @@
         </w:tc>
         <w:tc>
           <w:tcPr>
-            <w:tcW w:w="820" w:type="dxa"/>
-          </w:tcPr>
-          <w:p>
-            <w:pPr>
-              <w:pStyle w:val="Compact"/>
-              <w:jc w:val="left"/>
-              <w:rPr>
-                <w:sz w:val="16"/>
-                <w:szCs w:val="16"/>
-              </w:rPr>
-            </w:pPr>
-            <w:r>
-              <w:rPr>
-                <w:sz w:val="16"/>
-                <w:szCs w:val="16"/>
-              </w:rPr>
-              <w:t xml:space="preserve">wind_mm</w:t>
-            </w:r>
-          </w:p>
-        </w:tc>
-        <w:tc>
-          <w:tcPr>
-            <w:tcW w:w="1231" w:type="dxa"/>
+            <w:tcW w:w="2455" w:type="dxa"/>
+          </w:tcPr>
+          <w:p>
+            <w:pPr>
+              <w:pStyle w:val="Compact"/>
+              <w:jc w:val="left"/>
+              <w:rPr>
+                <w:sz w:val="16"/>
+                <w:szCs w:val="16"/>
+              </w:rPr>
+            </w:pPr>
+            <w:r>
+              <w:rPr>
+                <w:sz w:val="16"/>
+                <w:szCs w:val="16"/>
+              </w:rPr>
+              <w:t xml:space="preserve">Flight-window wind, terrain-resolved</w:t>
+            </w:r>
+          </w:p>
+        </w:tc>
+        <w:tc>
+          <w:tcPr>
+            <w:tcW w:w="995" w:type="dxa"/>
           </w:tcPr>
           <w:p>
             <w:pPr>
@@ -4496,7 +4496,7 @@
         </w:tc>
         <w:tc>
           <w:tcPr>
-            <w:tcW w:w="1067" w:type="dxa"/>
+            <w:tcW w:w="862" w:type="dxa"/>
           </w:tcPr>
           <w:p>
             <w:pPr>
@@ -4518,7 +4518,7 @@
         </w:tc>
         <w:tc>
           <w:tcPr>
-            <w:tcW w:w="1477" w:type="dxa"/>
+            <w:tcW w:w="1194" w:type="dxa"/>
           </w:tcPr>
           <w:p>
             <w:pPr>
@@ -4540,7 +4540,7 @@
         </w:tc>
         <w:tc>
           <w:tcPr>
-            <w:tcW w:w="820" w:type="dxa"/>
+            <w:tcW w:w="663" w:type="dxa"/>
           </w:tcPr>
           <w:p>
             <w:pPr>
@@ -4567,7 +4567,7 @@
         </w:trPr>
         <w:tc>
           <w:tcPr>
-            <w:tcW w:w="3939" w:type="dxa"/>
+            <w:tcW w:w="3185" w:type="dxa"/>
           </w:tcPr>
           <w:p>
             <w:pPr>
@@ -4589,29 +4589,29 @@
         </w:tc>
         <w:tc>
           <w:tcPr>
-            <w:tcW w:w="820" w:type="dxa"/>
-          </w:tcPr>
-          <w:p>
-            <w:pPr>
-              <w:pStyle w:val="Compact"/>
-              <w:jc w:val="left"/>
-              <w:rPr>
-                <w:sz w:val="16"/>
-                <w:szCs w:val="16"/>
-              </w:rPr>
-            </w:pPr>
-            <w:r>
-              <w:rPr>
-                <w:sz w:val="16"/>
-                <w:szCs w:val="16"/>
-              </w:rPr>
-              <w:t xml:space="preserve">shape</w:t>
-            </w:r>
-          </w:p>
-        </w:tc>
-        <w:tc>
-          <w:tcPr>
-            <w:tcW w:w="1231" w:type="dxa"/>
+            <w:tcW w:w="2455" w:type="dxa"/>
+          </w:tcPr>
+          <w:p>
+            <w:pPr>
+              <w:pStyle w:val="Compact"/>
+              <w:jc w:val="left"/>
+              <w:rPr>
+                <w:sz w:val="16"/>
+                <w:szCs w:val="16"/>
+              </w:rPr>
+            </w:pPr>
+            <w:r>
+              <w:rPr>
+                <w:sz w:val="16"/>
+                <w:szCs w:val="16"/>
+              </w:rPr>
+              <w:t xml:space="preserve">Terrain shape</w:t>
+            </w:r>
+          </w:p>
+        </w:tc>
+        <w:tc>
+          <w:tcPr>
+            <w:tcW w:w="995" w:type="dxa"/>
           </w:tcPr>
           <w:p>
             <w:pPr>
@@ -4633,7 +4633,7 @@
         </w:tc>
         <w:tc>
           <w:tcPr>
-            <w:tcW w:w="1067" w:type="dxa"/>
+            <w:tcW w:w="862" w:type="dxa"/>
           </w:tcPr>
           <w:p>
             <w:pPr>
@@ -4655,7 +4655,7 @@
         </w:tc>
         <w:tc>
           <w:tcPr>
-            <w:tcW w:w="1477" w:type="dxa"/>
+            <w:tcW w:w="1194" w:type="dxa"/>
           </w:tcPr>
           <w:p>
             <w:pPr>
@@ -4677,7 +4677,7 @@
         </w:tc>
         <w:tc>
           <w:tcPr>
-            <w:tcW w:w="820" w:type="dxa"/>
+            <w:tcW w:w="663" w:type="dxa"/>
           </w:tcPr>
           <w:p>
             <w:pPr>
@@ -4704,7 +4704,7 @@
         </w:trPr>
         <w:tc>
           <w:tcPr>
-            <w:tcW w:w="3939" w:type="dxa"/>
+            <w:tcW w:w="3185" w:type="dxa"/>
           </w:tcPr>
           <w:p>
             <w:pPr>
@@ -4726,29 +4726,29 @@
         </w:tc>
         <w:tc>
           <w:tcPr>
-            <w:tcW w:w="820" w:type="dxa"/>
-          </w:tcPr>
-          <w:p>
-            <w:pPr>
-              <w:pStyle w:val="Compact"/>
-              <w:jc w:val="left"/>
-              <w:rPr>
-                <w:sz w:val="16"/>
-                <w:szCs w:val="16"/>
-              </w:rPr>
-            </w:pPr>
-            <w:r>
-              <w:rPr>
-                <w:sz w:val="16"/>
-                <w:szCs w:val="16"/>
-              </w:rPr>
-              <w:t xml:space="preserve">flightsun</w:t>
-            </w:r>
-          </w:p>
-        </w:tc>
-        <w:tc>
-          <w:tcPr>
-            <w:tcW w:w="1231" w:type="dxa"/>
+            <w:tcW w:w="2455" w:type="dxa"/>
+          </w:tcPr>
+          <w:p>
+            <w:pPr>
+              <w:pStyle w:val="Compact"/>
+              <w:jc w:val="left"/>
+              <w:rPr>
+                <w:sz w:val="16"/>
+                <w:szCs w:val="16"/>
+              </w:rPr>
+            </w:pPr>
+            <w:r>
+              <w:rPr>
+                <w:sz w:val="16"/>
+                <w:szCs w:val="16"/>
+              </w:rPr>
+              <w:t xml:space="preserve">Flight-window radiation</w:t>
+            </w:r>
+          </w:p>
+        </w:tc>
+        <w:tc>
+          <w:tcPr>
+            <w:tcW w:w="995" w:type="dxa"/>
           </w:tcPr>
           <w:p>
             <w:pPr>
@@ -4770,7 +4770,7 @@
         </w:tc>
         <w:tc>
           <w:tcPr>
-            <w:tcW w:w="1067" w:type="dxa"/>
+            <w:tcW w:w="862" w:type="dxa"/>
           </w:tcPr>
           <w:p>
             <w:pPr>
@@ -4792,7 +4792,7 @@
         </w:tc>
         <w:tc>
           <w:tcPr>
-            <w:tcW w:w="1477" w:type="dxa"/>
+            <w:tcW w:w="1194" w:type="dxa"/>
           </w:tcPr>
           <w:p>
             <w:pPr>
@@ -4814,7 +4814,7 @@
         </w:tc>
         <w:tc>
           <w:tcPr>
-            <w:tcW w:w="820" w:type="dxa"/>
+            <w:tcW w:w="663" w:type="dxa"/>
           </w:tcPr>
           <w:p>
             <w:pPr>
@@ -4841,7 +4841,7 @@
         </w:trPr>
         <w:tc>
           <w:tcPr>
-            <w:tcW w:w="3939" w:type="dxa"/>
+            <w:tcW w:w="3185" w:type="dxa"/>
           </w:tcPr>
           <w:p>
             <w:pPr>
@@ -4863,29 +4863,29 @@
         </w:tc>
         <w:tc>
           <w:tcPr>
-            <w:tcW w:w="820" w:type="dxa"/>
-          </w:tcPr>
-          <w:p>
-            <w:pPr>
-              <w:pStyle w:val="Compact"/>
-              <w:jc w:val="left"/>
-              <w:rPr>
-                <w:sz w:val="16"/>
-                <w:szCs w:val="16"/>
-              </w:rPr>
-            </w:pPr>
-            <w:r>
-              <w:rPr>
-                <w:sz w:val="16"/>
-                <w:szCs w:val="16"/>
-              </w:rPr>
-              <w:t xml:space="preserve">shape</w:t>
-            </w:r>
-          </w:p>
-        </w:tc>
-        <w:tc>
-          <w:tcPr>
-            <w:tcW w:w="1231" w:type="dxa"/>
+            <w:tcW w:w="2455" w:type="dxa"/>
+          </w:tcPr>
+          <w:p>
+            <w:pPr>
+              <w:pStyle w:val="Compact"/>
+              <w:jc w:val="left"/>
+              <w:rPr>
+                <w:sz w:val="16"/>
+                <w:szCs w:val="16"/>
+              </w:rPr>
+            </w:pPr>
+            <w:r>
+              <w:rPr>
+                <w:sz w:val="16"/>
+                <w:szCs w:val="16"/>
+              </w:rPr>
+              <w:t xml:space="preserve">Terrain shape</w:t>
+            </w:r>
+          </w:p>
+        </w:tc>
+        <w:tc>
+          <w:tcPr>
+            <w:tcW w:w="995" w:type="dxa"/>
           </w:tcPr>
           <w:p>
             <w:pPr>
@@ -4907,7 +4907,7 @@
         </w:tc>
         <w:tc>
           <w:tcPr>
-            <w:tcW w:w="1067" w:type="dxa"/>
+            <w:tcW w:w="862" w:type="dxa"/>
           </w:tcPr>
           <w:p>
             <w:pPr>
@@ -4929,7 +4929,7 @@
         </w:tc>
         <w:tc>
           <w:tcPr>
-            <w:tcW w:w="1477" w:type="dxa"/>
+            <w:tcW w:w="1194" w:type="dxa"/>
           </w:tcPr>
           <w:p>
             <w:pPr>
@@ -4951,7 +4951,7 @@
         </w:tc>
         <w:tc>
           <w:tcPr>
-            <w:tcW w:w="820" w:type="dxa"/>
+            <w:tcW w:w="663" w:type="dxa"/>
           </w:tcPr>
           <w:p>
             <w:pPr>
@@ -4971,7 +4971,7 @@
         </w:trPr>
         <w:tc>
           <w:tcPr>
-            <w:tcW w:w="3939" w:type="dxa"/>
+            <w:tcW w:w="3185" w:type="dxa"/>
           </w:tcPr>
           <w:p>
             <w:pPr>
@@ -4993,29 +4993,29 @@
         </w:tc>
         <w:tc>
           <w:tcPr>
-            <w:tcW w:w="820" w:type="dxa"/>
-          </w:tcPr>
-          <w:p>
-            <w:pPr>
-              <w:pStyle w:val="Compact"/>
-              <w:jc w:val="left"/>
-              <w:rPr>
-                <w:sz w:val="16"/>
-                <w:szCs w:val="16"/>
-              </w:rPr>
-            </w:pPr>
-            <w:r>
-              <w:rPr>
-                <w:sz w:val="16"/>
-                <w:szCs w:val="16"/>
-              </w:rPr>
-              <w:t xml:space="preserve">shape</w:t>
-            </w:r>
-          </w:p>
-        </w:tc>
-        <w:tc>
-          <w:tcPr>
-            <w:tcW w:w="1231" w:type="dxa"/>
+            <w:tcW w:w="2455" w:type="dxa"/>
+          </w:tcPr>
+          <w:p>
+            <w:pPr>
+              <w:pStyle w:val="Compact"/>
+              <w:jc w:val="left"/>
+              <w:rPr>
+                <w:sz w:val="16"/>
+                <w:szCs w:val="16"/>
+              </w:rPr>
+            </w:pPr>
+            <w:r>
+              <w:rPr>
+                <w:sz w:val="16"/>
+                <w:szCs w:val="16"/>
+              </w:rPr>
+              <w:t xml:space="preserve">Terrain shape</w:t>
+            </w:r>
+          </w:p>
+        </w:tc>
+        <w:tc>
+          <w:tcPr>
+            <w:tcW w:w="995" w:type="dxa"/>
           </w:tcPr>
           <w:p>
             <w:pPr>
@@ -5037,7 +5037,7 @@
         </w:tc>
         <w:tc>
           <w:tcPr>
-            <w:tcW w:w="1067" w:type="dxa"/>
+            <w:tcW w:w="862" w:type="dxa"/>
           </w:tcPr>
           <w:p>
             <w:pPr>
@@ -5059,7 +5059,7 @@
         </w:tc>
         <w:tc>
           <w:tcPr>
-            <w:tcW w:w="1477" w:type="dxa"/>
+            <w:tcW w:w="1194" w:type="dxa"/>
           </w:tcPr>
           <w:p>
             <w:pPr>
@@ -5081,7 +5081,7 @@
         </w:tc>
         <w:tc>
           <w:tcPr>
-            <w:tcW w:w="820" w:type="dxa"/>
+            <w:tcW w:w="663" w:type="dxa"/>
           </w:tcPr>
           <w:p>
             <w:pPr>
@@ -5101,7 +5101,7 @@
         </w:trPr>
         <w:tc>
           <w:tcPr>
-            <w:tcW w:w="3939" w:type="dxa"/>
+            <w:tcW w:w="3185" w:type="dxa"/>
           </w:tcPr>
           <w:p>
             <w:pPr>
@@ -5123,29 +5123,29 @@
         </w:tc>
         <w:tc>
           <w:tcPr>
-            <w:tcW w:w="820" w:type="dxa"/>
-          </w:tcPr>
-          <w:p>
-            <w:pPr>
-              <w:pStyle w:val="Compact"/>
-              <w:jc w:val="left"/>
-              <w:rPr>
-                <w:sz w:val="16"/>
-                <w:szCs w:val="16"/>
-              </w:rPr>
-            </w:pPr>
-            <w:r>
-              <w:rPr>
-                <w:sz w:val="16"/>
-                <w:szCs w:val="16"/>
-              </w:rPr>
-              <w:t xml:space="preserve">landform</w:t>
-            </w:r>
-          </w:p>
-        </w:tc>
-        <w:tc>
-          <w:tcPr>
-            <w:tcW w:w="1231" w:type="dxa"/>
+            <w:tcW w:w="2455" w:type="dxa"/>
+          </w:tcPr>
+          <w:p>
+            <w:pPr>
+              <w:pStyle w:val="Compact"/>
+              <w:jc w:val="left"/>
+              <w:rPr>
+                <w:sz w:val="16"/>
+                <w:szCs w:val="16"/>
+              </w:rPr>
+            </w:pPr>
+            <w:r>
+              <w:rPr>
+                <w:sz w:val="16"/>
+                <w:szCs w:val="16"/>
+              </w:rPr>
+              <w:t xml:space="preserve">Landform</w:t>
+            </w:r>
+          </w:p>
+        </w:tc>
+        <w:tc>
+          <w:tcPr>
+            <w:tcW w:w="995" w:type="dxa"/>
           </w:tcPr>
           <w:p>
             <w:pPr>
@@ -5167,7 +5167,7 @@
         </w:tc>
         <w:tc>
           <w:tcPr>
-            <w:tcW w:w="1067" w:type="dxa"/>
+            <w:tcW w:w="862" w:type="dxa"/>
           </w:tcPr>
           <w:p>
             <w:pPr>
@@ -5189,7 +5189,7 @@
         </w:tc>
         <w:tc>
           <w:tcPr>
-            <w:tcW w:w="1477" w:type="dxa"/>
+            <w:tcW w:w="1194" w:type="dxa"/>
           </w:tcPr>
           <w:p>
             <w:pPr>
@@ -5211,7 +5211,7 @@
         </w:tc>
         <w:tc>
           <w:tcPr>
-            <w:tcW w:w="820" w:type="dxa"/>
+            <w:tcW w:w="663" w:type="dxa"/>
           </w:tcPr>
           <w:p>
             <w:pPr>
@@ -5231,7 +5231,7 @@
         </w:trPr>
         <w:tc>
           <w:tcPr>
-            <w:tcW w:w="3939" w:type="dxa"/>
+            <w:tcW w:w="3185" w:type="dxa"/>
           </w:tcPr>
           <w:p>
             <w:pPr>
@@ -5253,29 +5253,29 @@
         </w:tc>
         <w:tc>
           <w:tcPr>
-            <w:tcW w:w="820" w:type="dxa"/>
-          </w:tcPr>
-          <w:p>
-            <w:pPr>
-              <w:pStyle w:val="Compact"/>
-              <w:jc w:val="left"/>
-              <w:rPr>
-                <w:sz w:val="16"/>
-                <w:szCs w:val="16"/>
-              </w:rPr>
-            </w:pPr>
-            <w:r>
-              <w:rPr>
-                <w:sz w:val="16"/>
-                <w:szCs w:val="16"/>
-              </w:rPr>
-              <w:t xml:space="preserve">density</w:t>
-            </w:r>
-          </w:p>
-        </w:tc>
-        <w:tc>
-          <w:tcPr>
-            <w:tcW w:w="1231" w:type="dxa"/>
+            <w:tcW w:w="2455" w:type="dxa"/>
+          </w:tcPr>
+          <w:p>
+            <w:pPr>
+              <w:pStyle w:val="Compact"/>
+              <w:jc w:val="left"/>
+              <w:rPr>
+                <w:sz w:val="16"/>
+                <w:szCs w:val="16"/>
+              </w:rPr>
+            </w:pPr>
+            <w:r>
+              <w:rPr>
+                <w:sz w:val="16"/>
+                <w:szCs w:val="16"/>
+              </w:rPr>
+              <w:t xml:space="preserve">Stand density</w:t>
+            </w:r>
+          </w:p>
+        </w:tc>
+        <w:tc>
+          <w:tcPr>
+            <w:tcW w:w="995" w:type="dxa"/>
           </w:tcPr>
           <w:p>
             <w:pPr>
@@ -5297,7 +5297,7 @@
         </w:tc>
         <w:tc>
           <w:tcPr>
-            <w:tcW w:w="1067" w:type="dxa"/>
+            <w:tcW w:w="862" w:type="dxa"/>
           </w:tcPr>
           <w:p>
             <w:pPr>
@@ -5319,7 +5319,7 @@
         </w:tc>
         <w:tc>
           <w:tcPr>
-            <w:tcW w:w="1477" w:type="dxa"/>
+            <w:tcW w:w="1194" w:type="dxa"/>
           </w:tcPr>
           <w:p>
             <w:pPr>
@@ -5341,7 +5341,7 @@
         </w:tc>
         <w:tc>
           <w:tcPr>
-            <w:tcW w:w="820" w:type="dxa"/>
+            <w:tcW w:w="663" w:type="dxa"/>
           </w:tcPr>
           <w:p>
             <w:pPr>
@@ -5361,7 +5361,7 @@
         </w:trPr>
         <w:tc>
           <w:tcPr>
-            <w:tcW w:w="3939" w:type="dxa"/>
+            <w:tcW w:w="3185" w:type="dxa"/>
           </w:tcPr>
           <w:p>
             <w:pPr>
@@ -5383,29 +5383,29 @@
         </w:tc>
         <w:tc>
           <w:tcPr>
-            <w:tcW w:w="820" w:type="dxa"/>
-          </w:tcPr>
-          <w:p>
-            <w:pPr>
-              <w:pStyle w:val="Compact"/>
-              <w:jc w:val="left"/>
-              <w:rPr>
-                <w:sz w:val="16"/>
-                <w:szCs w:val="16"/>
-              </w:rPr>
-            </w:pPr>
-            <w:r>
-              <w:rPr>
-                <w:sz w:val="16"/>
-                <w:szCs w:val="16"/>
-              </w:rPr>
-              <w:t xml:space="preserve">landform</w:t>
-            </w:r>
-          </w:p>
-        </w:tc>
-        <w:tc>
-          <w:tcPr>
-            <w:tcW w:w="1231" w:type="dxa"/>
+            <w:tcW w:w="2455" w:type="dxa"/>
+          </w:tcPr>
+          <w:p>
+            <w:pPr>
+              <w:pStyle w:val="Compact"/>
+              <w:jc w:val="left"/>
+              <w:rPr>
+                <w:sz w:val="16"/>
+                <w:szCs w:val="16"/>
+              </w:rPr>
+            </w:pPr>
+            <w:r>
+              <w:rPr>
+                <w:sz w:val="16"/>
+                <w:szCs w:val="16"/>
+              </w:rPr>
+              <w:t xml:space="preserve">Landform</w:t>
+            </w:r>
+          </w:p>
+        </w:tc>
+        <w:tc>
+          <w:tcPr>
+            <w:tcW w:w="995" w:type="dxa"/>
           </w:tcPr>
           <w:p>
             <w:pPr>
@@ -5427,7 +5427,7 @@
         </w:tc>
         <w:tc>
           <w:tcPr>
-            <w:tcW w:w="1067" w:type="dxa"/>
+            <w:tcW w:w="862" w:type="dxa"/>
           </w:tcPr>
           <w:p>
             <w:pPr>
@@ -5449,7 +5449,7 @@
         </w:tc>
         <w:tc>
           <w:tcPr>
-            <w:tcW w:w="1477" w:type="dxa"/>
+            <w:tcW w:w="1194" w:type="dxa"/>
           </w:tcPr>
           <w:p>
             <w:pPr>
@@ -5471,7 +5471,7 @@
         </w:tc>
         <w:tc>
           <w:tcPr>
-            <w:tcW w:w="820" w:type="dxa"/>
+            <w:tcW w:w="663" w:type="dxa"/>
           </w:tcPr>
           <w:p>
             <w:pPr>
@@ -5491,7 +5491,7 @@
         </w:trPr>
         <w:tc>
           <w:tcPr>
-            <w:tcW w:w="3939" w:type="dxa"/>
+            <w:tcW w:w="3185" w:type="dxa"/>
           </w:tcPr>
           <w:p>
             <w:pPr>
@@ -5513,29 +5513,29 @@
         </w:tc>
         <w:tc>
           <w:tcPr>
-            <w:tcW w:w="820" w:type="dxa"/>
-          </w:tcPr>
-          <w:p>
-            <w:pPr>
-              <w:pStyle w:val="Compact"/>
-              <w:jc w:val="left"/>
-              <w:rPr>
-                <w:sz w:val="16"/>
-                <w:szCs w:val="16"/>
-              </w:rPr>
-            </w:pPr>
-            <w:r>
-              <w:rPr>
-                <w:sz w:val="16"/>
-                <w:szCs w:val="16"/>
-              </w:rPr>
-              <w:t xml:space="preserve">landform</w:t>
-            </w:r>
-          </w:p>
-        </w:tc>
-        <w:tc>
-          <w:tcPr>
-            <w:tcW w:w="1231" w:type="dxa"/>
+            <w:tcW w:w="2455" w:type="dxa"/>
+          </w:tcPr>
+          <w:p>
+            <w:pPr>
+              <w:pStyle w:val="Compact"/>
+              <w:jc w:val="left"/>
+              <w:rPr>
+                <w:sz w:val="16"/>
+                <w:szCs w:val="16"/>
+              </w:rPr>
+            </w:pPr>
+            <w:r>
+              <w:rPr>
+                <w:sz w:val="16"/>
+                <w:szCs w:val="16"/>
+              </w:rPr>
+              <w:t xml:space="preserve">Landform</w:t>
+            </w:r>
+          </w:p>
+        </w:tc>
+        <w:tc>
+          <w:tcPr>
+            <w:tcW w:w="995" w:type="dxa"/>
           </w:tcPr>
           <w:p>
             <w:pPr>
@@ -5557,7 +5557,7 @@
         </w:tc>
         <w:tc>
           <w:tcPr>
-            <w:tcW w:w="1067" w:type="dxa"/>
+            <w:tcW w:w="862" w:type="dxa"/>
           </w:tcPr>
           <w:p>
             <w:pPr>
@@ -5579,7 +5579,7 @@
         </w:tc>
         <w:tc>
           <w:tcPr>
-            <w:tcW w:w="1477" w:type="dxa"/>
+            <w:tcW w:w="1194" w:type="dxa"/>
           </w:tcPr>
           <w:p>
             <w:pPr>
@@ -5601,7 +5601,7 @@
         </w:tc>
         <w:tc>
           <w:tcPr>
-            <w:tcW w:w="820" w:type="dxa"/>
+            <w:tcW w:w="663" w:type="dxa"/>
           </w:tcPr>
           <w:p>
             <w:pPr>
@@ -5621,7 +5621,7 @@
         </w:trPr>
         <w:tc>
           <w:tcPr>
-            <w:tcW w:w="3939" w:type="dxa"/>
+            <w:tcW w:w="3185" w:type="dxa"/>
           </w:tcPr>
           <w:p>
             <w:pPr>
@@ -5643,29 +5643,29 @@
         </w:tc>
         <w:tc>
           <w:tcPr>
-            <w:tcW w:w="820" w:type="dxa"/>
-          </w:tcPr>
-          <w:p>
-            <w:pPr>
-              <w:pStyle w:val="Compact"/>
-              <w:jc w:val="left"/>
-              <w:rPr>
-                <w:sz w:val="16"/>
-                <w:szCs w:val="16"/>
-              </w:rPr>
-            </w:pPr>
-            <w:r>
-              <w:rPr>
-                <w:sz w:val="16"/>
-                <w:szCs w:val="16"/>
-              </w:rPr>
-              <w:t xml:space="preserve">density</w:t>
-            </w:r>
-          </w:p>
-        </w:tc>
-        <w:tc>
-          <w:tcPr>
-            <w:tcW w:w="1231" w:type="dxa"/>
+            <w:tcW w:w="2455" w:type="dxa"/>
+          </w:tcPr>
+          <w:p>
+            <w:pPr>
+              <w:pStyle w:val="Compact"/>
+              <w:jc w:val="left"/>
+              <w:rPr>
+                <w:sz w:val="16"/>
+                <w:szCs w:val="16"/>
+              </w:rPr>
+            </w:pPr>
+            <w:r>
+              <w:rPr>
+                <w:sz w:val="16"/>
+                <w:szCs w:val="16"/>
+              </w:rPr>
+              <w:t xml:space="preserve">Stand density</w:t>
+            </w:r>
+          </w:p>
+        </w:tc>
+        <w:tc>
+          <w:tcPr>
+            <w:tcW w:w="995" w:type="dxa"/>
           </w:tcPr>
           <w:p>
             <w:pPr>
@@ -5687,7 +5687,7 @@
         </w:tc>
         <w:tc>
           <w:tcPr>
-            <w:tcW w:w="1067" w:type="dxa"/>
+            <w:tcW w:w="862" w:type="dxa"/>
           </w:tcPr>
           <w:p>
             <w:pPr>
@@ -5709,7 +5709,7 @@
         </w:tc>
         <w:tc>
           <w:tcPr>
-            <w:tcW w:w="1477" w:type="dxa"/>
+            <w:tcW w:w="1194" w:type="dxa"/>
           </w:tcPr>
           <w:p>
             <w:pPr>
@@ -5731,7 +5731,7 @@
         </w:tc>
         <w:tc>
           <w:tcPr>
-            <w:tcW w:w="820" w:type="dxa"/>
+            <w:tcW w:w="663" w:type="dxa"/>
           </w:tcPr>
           <w:p>
             <w:pPr>
@@ -5751,7 +5751,7 @@
         </w:trPr>
         <w:tc>
           <w:tcPr>
-            <w:tcW w:w="3939" w:type="dxa"/>
+            <w:tcW w:w="3185" w:type="dxa"/>
           </w:tcPr>
           <w:p>
             <w:pPr>
@@ -5773,29 +5773,29 @@
         </w:tc>
         <w:tc>
           <w:tcPr>
-            <w:tcW w:w="820" w:type="dxa"/>
-          </w:tcPr>
-          <w:p>
-            <w:pPr>
-              <w:pStyle w:val="Compact"/>
-              <w:jc w:val="left"/>
-              <w:rPr>
-                <w:sz w:val="16"/>
-                <w:szCs w:val="16"/>
-              </w:rPr>
-            </w:pPr>
-            <w:r>
-              <w:rPr>
-                <w:sz w:val="16"/>
-                <w:szCs w:val="16"/>
-              </w:rPr>
-              <w:t xml:space="preserve">shape</w:t>
-            </w:r>
-          </w:p>
-        </w:tc>
-        <w:tc>
-          <w:tcPr>
-            <w:tcW w:w="1231" w:type="dxa"/>
+            <w:tcW w:w="2455" w:type="dxa"/>
+          </w:tcPr>
+          <w:p>
+            <w:pPr>
+              <w:pStyle w:val="Compact"/>
+              <w:jc w:val="left"/>
+              <w:rPr>
+                <w:sz w:val="16"/>
+                <w:szCs w:val="16"/>
+              </w:rPr>
+            </w:pPr>
+            <w:r>
+              <w:rPr>
+                <w:sz w:val="16"/>
+                <w:szCs w:val="16"/>
+              </w:rPr>
+              <w:t xml:space="preserve">Terrain shape</w:t>
+            </w:r>
+          </w:p>
+        </w:tc>
+        <w:tc>
+          <w:tcPr>
+            <w:tcW w:w="995" w:type="dxa"/>
           </w:tcPr>
           <w:p>
             <w:pPr>
@@ -5817,7 +5817,7 @@
         </w:tc>
         <w:tc>
           <w:tcPr>
-            <w:tcW w:w="1067" w:type="dxa"/>
+            <w:tcW w:w="862" w:type="dxa"/>
           </w:tcPr>
           <w:p>
             <w:pPr>
@@ -5839,7 +5839,7 @@
         </w:tc>
         <w:tc>
           <w:tcPr>
-            <w:tcW w:w="1477" w:type="dxa"/>
+            <w:tcW w:w="1194" w:type="dxa"/>
           </w:tcPr>
           <w:p>
             <w:pPr>
@@ -5861,7 +5861,7 @@
         </w:tc>
         <w:tc>
           <w:tcPr>
-            <w:tcW w:w="820" w:type="dxa"/>
+            <w:tcW w:w="663" w:type="dxa"/>
           </w:tcPr>
           <w:p>
             <w:pPr>
@@ -5881,7 +5881,7 @@
         </w:trPr>
         <w:tc>
           <w:tcPr>
-            <w:tcW w:w="3939" w:type="dxa"/>
+            <w:tcW w:w="3185" w:type="dxa"/>
           </w:tcPr>
           <w:p>
             <w:pPr>
@@ -5903,29 +5903,29 @@
         </w:tc>
         <w:tc>
           <w:tcPr>
-            <w:tcW w:w="820" w:type="dxa"/>
-          </w:tcPr>
-          <w:p>
-            <w:pPr>
-              <w:pStyle w:val="Compact"/>
-              <w:jc w:val="left"/>
-              <w:rPr>
-                <w:sz w:val="16"/>
-                <w:szCs w:val="16"/>
-              </w:rPr>
-            </w:pPr>
-            <w:r>
-              <w:rPr>
-                <w:sz w:val="16"/>
-                <w:szCs w:val="16"/>
-              </w:rPr>
-              <w:t xml:space="preserve">shape</w:t>
-            </w:r>
-          </w:p>
-        </w:tc>
-        <w:tc>
-          <w:tcPr>
-            <w:tcW w:w="1231" w:type="dxa"/>
+            <w:tcW w:w="2455" w:type="dxa"/>
+          </w:tcPr>
+          <w:p>
+            <w:pPr>
+              <w:pStyle w:val="Compact"/>
+              <w:jc w:val="left"/>
+              <w:rPr>
+                <w:sz w:val="16"/>
+                <w:szCs w:val="16"/>
+              </w:rPr>
+            </w:pPr>
+            <w:r>
+              <w:rPr>
+                <w:sz w:val="16"/>
+                <w:szCs w:val="16"/>
+              </w:rPr>
+              <w:t xml:space="preserve">Terrain shape</w:t>
+            </w:r>
+          </w:p>
+        </w:tc>
+        <w:tc>
+          <w:tcPr>
+            <w:tcW w:w="995" w:type="dxa"/>
           </w:tcPr>
           <w:p>
             <w:pPr>
@@ -5947,7 +5947,7 @@
         </w:tc>
         <w:tc>
           <w:tcPr>
-            <w:tcW w:w="1067" w:type="dxa"/>
+            <w:tcW w:w="862" w:type="dxa"/>
           </w:tcPr>
           <w:p>
             <w:pPr>
@@ -5969,7 +5969,7 @@
         </w:tc>
         <w:tc>
           <w:tcPr>
-            <w:tcW w:w="1477" w:type="dxa"/>
+            <w:tcW w:w="1194" w:type="dxa"/>
           </w:tcPr>
           <w:p>
             <w:pPr>
@@ -5991,7 +5991,7 @@
         </w:tc>
         <w:tc>
           <w:tcPr>
-            <w:tcW w:w="820" w:type="dxa"/>
+            <w:tcW w:w="663" w:type="dxa"/>
           </w:tcPr>
           <w:p>
             <w:pPr>
@@ -6011,7 +6011,7 @@
         </w:trPr>
         <w:tc>
           <w:tcPr>
-            <w:tcW w:w="3939" w:type="dxa"/>
+            <w:tcW w:w="3185" w:type="dxa"/>
           </w:tcPr>
           <w:p>
             <w:pPr>
@@ -6033,29 +6033,29 @@
         </w:tc>
         <w:tc>
           <w:tcPr>
-            <w:tcW w:w="820" w:type="dxa"/>
-          </w:tcPr>
-          <w:p>
-            <w:pPr>
-              <w:pStyle w:val="Compact"/>
-              <w:jc w:val="left"/>
-              <w:rPr>
-                <w:sz w:val="16"/>
-                <w:szCs w:val="16"/>
-              </w:rPr>
-            </w:pPr>
-            <w:r>
-              <w:rPr>
-                <w:sz w:val="16"/>
-                <w:szCs w:val="16"/>
-              </w:rPr>
-              <w:t xml:space="preserve">landform</w:t>
-            </w:r>
-          </w:p>
-        </w:tc>
-        <w:tc>
-          <w:tcPr>
-            <w:tcW w:w="1231" w:type="dxa"/>
+            <w:tcW w:w="2455" w:type="dxa"/>
+          </w:tcPr>
+          <w:p>
+            <w:pPr>
+              <w:pStyle w:val="Compact"/>
+              <w:jc w:val="left"/>
+              <w:rPr>
+                <w:sz w:val="16"/>
+                <w:szCs w:val="16"/>
+              </w:rPr>
+            </w:pPr>
+            <w:r>
+              <w:rPr>
+                <w:sz w:val="16"/>
+                <w:szCs w:val="16"/>
+              </w:rPr>
+              <w:t xml:space="preserve">Landform</w:t>
+            </w:r>
+          </w:p>
+        </w:tc>
+        <w:tc>
+          <w:tcPr>
+            <w:tcW w:w="995" w:type="dxa"/>
           </w:tcPr>
           <w:p>
             <w:pPr>
@@ -6077,7 +6077,7 @@
         </w:tc>
         <w:tc>
           <w:tcPr>
-            <w:tcW w:w="1067" w:type="dxa"/>
+            <w:tcW w:w="862" w:type="dxa"/>
           </w:tcPr>
           <w:p>
             <w:pPr>
@@ -6099,7 +6099,7 @@
         </w:tc>
         <w:tc>
           <w:tcPr>
-            <w:tcW w:w="1477" w:type="dxa"/>
+            <w:tcW w:w="1194" w:type="dxa"/>
           </w:tcPr>
           <w:p>
             <w:pPr>
@@ -6121,7 +6121,7 @@
         </w:tc>
         <w:tc>
           <w:tcPr>
-            <w:tcW w:w="820" w:type="dxa"/>
+            <w:tcW w:w="663" w:type="dxa"/>
           </w:tcPr>
           <w:p>
             <w:pPr>
@@ -6141,7 +6141,7 @@
         </w:trPr>
         <w:tc>
           <w:tcPr>
-            <w:tcW w:w="3939" w:type="dxa"/>
+            <w:tcW w:w="3185" w:type="dxa"/>
           </w:tcPr>
           <w:p>
             <w:pPr>
@@ -6163,29 +6163,29 @@
         </w:tc>
         <w:tc>
           <w:tcPr>
-            <w:tcW w:w="820" w:type="dxa"/>
-          </w:tcPr>
-          <w:p>
-            <w:pPr>
-              <w:pStyle w:val="Compact"/>
-              <w:jc w:val="left"/>
-              <w:rPr>
-                <w:sz w:val="16"/>
-                <w:szCs w:val="16"/>
-              </w:rPr>
-            </w:pPr>
-            <w:r>
-              <w:rPr>
-                <w:sz w:val="16"/>
-                <w:szCs w:val="16"/>
-              </w:rPr>
-              <w:t xml:space="preserve">wind_t</w:t>
-            </w:r>
-          </w:p>
-        </w:tc>
-        <w:tc>
-          <w:tcPr>
-            <w:tcW w:w="1231" w:type="dxa"/>
+            <w:tcW w:w="2455" w:type="dxa"/>
+          </w:tcPr>
+          <w:p>
+            <w:pPr>
+              <w:pStyle w:val="Compact"/>
+              <w:jc w:val="left"/>
+              <w:rPr>
+                <w:sz w:val="16"/>
+                <w:szCs w:val="16"/>
+              </w:rPr>
+            </w:pPr>
+            <w:r>
+              <w:rPr>
+                <w:sz w:val="16"/>
+                <w:szCs w:val="16"/>
+              </w:rPr>
+              <w:t xml:space="preserve">Flight-window wind, stations</w:t>
+            </w:r>
+          </w:p>
+        </w:tc>
+        <w:tc>
+          <w:tcPr>
+            <w:tcW w:w="995" w:type="dxa"/>
           </w:tcPr>
           <w:p>
             <w:pPr>
@@ -6207,7 +6207,7 @@
         </w:tc>
         <w:tc>
           <w:tcPr>
-            <w:tcW w:w="1067" w:type="dxa"/>
+            <w:tcW w:w="862" w:type="dxa"/>
           </w:tcPr>
           <w:p>
             <w:pPr>
@@ -6229,7 +6229,7 @@
         </w:tc>
         <w:tc>
           <w:tcPr>
-            <w:tcW w:w="1477" w:type="dxa"/>
+            <w:tcW w:w="1194" w:type="dxa"/>
           </w:tcPr>
           <w:p>
             <w:pPr>
@@ -6251,7 +6251,7 @@
         </w:tc>
         <w:tc>
           <w:tcPr>
-            <w:tcW w:w="820" w:type="dxa"/>
+            <w:tcW w:w="663" w:type="dxa"/>
           </w:tcPr>
           <w:p>
             <w:pPr>
@@ -6271,7 +6271,7 @@
         </w:trPr>
         <w:tc>
           <w:tcPr>
-            <w:tcW w:w="3939" w:type="dxa"/>
+            <w:tcW w:w="3185" w:type="dxa"/>
           </w:tcPr>
           <w:p>
             <w:pPr>
@@ -6293,29 +6293,29 @@
         </w:tc>
         <w:tc>
           <w:tcPr>
-            <w:tcW w:w="820" w:type="dxa"/>
-          </w:tcPr>
-          <w:p>
-            <w:pPr>
-              <w:pStyle w:val="Compact"/>
-              <w:jc w:val="left"/>
-              <w:rPr>
-                <w:sz w:val="16"/>
-                <w:szCs w:val="16"/>
-              </w:rPr>
-            </w:pPr>
-            <w:r>
-              <w:rPr>
-                <w:sz w:val="16"/>
-                <w:szCs w:val="16"/>
-              </w:rPr>
-              <w:t xml:space="preserve">shading</w:t>
-            </w:r>
-          </w:p>
-        </w:tc>
-        <w:tc>
-          <w:tcPr>
-            <w:tcW w:w="1231" w:type="dxa"/>
+            <w:tcW w:w="2455" w:type="dxa"/>
+          </w:tcPr>
+          <w:p>
+            <w:pPr>
+              <w:pStyle w:val="Compact"/>
+              <w:jc w:val="left"/>
+              <w:rPr>
+                <w:sz w:val="16"/>
+                <w:szCs w:val="16"/>
+              </w:rPr>
+            </w:pPr>
+            <w:r>
+              <w:rPr>
+                <w:sz w:val="16"/>
+                <w:szCs w:val="16"/>
+              </w:rPr>
+              <w:t xml:space="preserve">Topographic shading</w:t>
+            </w:r>
+          </w:p>
+        </w:tc>
+        <w:tc>
+          <w:tcPr>
+            <w:tcW w:w="995" w:type="dxa"/>
           </w:tcPr>
           <w:p>
             <w:pPr>
@@ -6337,7 +6337,7 @@
         </w:tc>
         <w:tc>
           <w:tcPr>
-            <w:tcW w:w="1067" w:type="dxa"/>
+            <w:tcW w:w="862" w:type="dxa"/>
           </w:tcPr>
           <w:p>
             <w:pPr>
@@ -6359,7 +6359,7 @@
         </w:tc>
         <w:tc>
           <w:tcPr>
-            <w:tcW w:w="1477" w:type="dxa"/>
+            <w:tcW w:w="1194" w:type="dxa"/>
           </w:tcPr>
           <w:p>
             <w:pPr>
@@ -6381,7 +6381,7 @@
         </w:tc>
         <w:tc>
           <w:tcPr>
-            <w:tcW w:w="820" w:type="dxa"/>
+            <w:tcW w:w="663" w:type="dxa"/>
           </w:tcPr>
           <w:p>
             <w:pPr>
@@ -6401,7 +6401,7 @@
         </w:trPr>
         <w:tc>
           <w:tcPr>
-            <w:tcW w:w="3939" w:type="dxa"/>
+            <w:tcW w:w="3185" w:type="dxa"/>
           </w:tcPr>
           <w:p>
             <w:pPr>
@@ -6423,29 +6423,29 @@
         </w:tc>
         <w:tc>
           <w:tcPr>
-            <w:tcW w:w="820" w:type="dxa"/>
-          </w:tcPr>
-          <w:p>
-            <w:pPr>
-              <w:pStyle w:val="Compact"/>
-              <w:jc w:val="left"/>
-              <w:rPr>
-                <w:sz w:val="16"/>
-                <w:szCs w:val="16"/>
-              </w:rPr>
-            </w:pPr>
-            <w:r>
-              <w:rPr>
-                <w:sz w:val="16"/>
-                <w:szCs w:val="16"/>
-              </w:rPr>
-              <w:t xml:space="preserve">wind_geo</w:t>
-            </w:r>
-          </w:p>
-        </w:tc>
-        <w:tc>
-          <w:tcPr>
-            <w:tcW w:w="1231" w:type="dxa"/>
+            <w:tcW w:w="2455" w:type="dxa"/>
+          </w:tcPr>
+          <w:p>
+            <w:pPr>
+              <w:pStyle w:val="Compact"/>
+              <w:jc w:val="left"/>
+              <w:rPr>
+                <w:sz w:val="16"/>
+                <w:szCs w:val="16"/>
+              </w:rPr>
+            </w:pPr>
+            <w:r>
+              <w:rPr>
+                <w:sz w:val="16"/>
+                <w:szCs w:val="16"/>
+              </w:rPr>
+              <w:t xml:space="preserve">Terrain exposure to wind</w:t>
+            </w:r>
+          </w:p>
+        </w:tc>
+        <w:tc>
+          <w:tcPr>
+            <w:tcW w:w="995" w:type="dxa"/>
           </w:tcPr>
           <w:p>
             <w:pPr>
@@ -6467,7 +6467,7 @@
         </w:tc>
         <w:tc>
           <w:tcPr>
-            <w:tcW w:w="1067" w:type="dxa"/>
+            <w:tcW w:w="862" w:type="dxa"/>
           </w:tcPr>
           <w:p>
             <w:pPr>
@@ -6489,7 +6489,7 @@
         </w:tc>
         <w:tc>
           <w:tcPr>
-            <w:tcW w:w="1477" w:type="dxa"/>
+            <w:tcW w:w="1194" w:type="dxa"/>
           </w:tcPr>
           <w:p>
             <w:pPr>
@@ -6511,7 +6511,7 @@
         </w:tc>
         <w:tc>
           <w:tcPr>
-            <w:tcW w:w="820" w:type="dxa"/>
+            <w:tcW w:w="663" w:type="dxa"/>
           </w:tcPr>
           <w:p>
             <w:pPr>
@@ -6531,7 +6531,7 @@
         </w:trPr>
         <w:tc>
           <w:tcPr>
-            <w:tcW w:w="3939" w:type="dxa"/>
+            <w:tcW w:w="3185" w:type="dxa"/>
           </w:tcPr>
           <w:p>
             <w:pPr>
@@ -6553,29 +6553,29 @@
         </w:tc>
         <w:tc>
           <w:tcPr>
-            <w:tcW w:w="820" w:type="dxa"/>
-          </w:tcPr>
-          <w:p>
-            <w:pPr>
-              <w:pStyle w:val="Compact"/>
-              <w:jc w:val="left"/>
-              <w:rPr>
-                <w:sz w:val="16"/>
-                <w:szCs w:val="16"/>
-              </w:rPr>
-            </w:pPr>
-            <w:r>
-              <w:rPr>
-                <w:sz w:val="16"/>
-                <w:szCs w:val="16"/>
-              </w:rPr>
-              <w:t xml:space="preserve">hostsize</w:t>
-            </w:r>
-          </w:p>
-        </w:tc>
-        <w:tc>
-          <w:tcPr>
-            <w:tcW w:w="1231" w:type="dxa"/>
+            <w:tcW w:w="2455" w:type="dxa"/>
+          </w:tcPr>
+          <w:p>
+            <w:pPr>
+              <w:pStyle w:val="Compact"/>
+              <w:jc w:val="left"/>
+              <w:rPr>
+                <w:sz w:val="16"/>
+                <w:szCs w:val="16"/>
+              </w:rPr>
+            </w:pPr>
+            <w:r>
+              <w:rPr>
+                <w:sz w:val="16"/>
+                <w:szCs w:val="16"/>
+              </w:rPr>
+              <w:t xml:space="preserve">Host size</w:t>
+            </w:r>
+          </w:p>
+        </w:tc>
+        <w:tc>
+          <w:tcPr>
+            <w:tcW w:w="995" w:type="dxa"/>
           </w:tcPr>
           <w:p>
             <w:pPr>
@@ -6597,7 +6597,7 @@
         </w:tc>
         <w:tc>
           <w:tcPr>
-            <w:tcW w:w="1067" w:type="dxa"/>
+            <w:tcW w:w="862" w:type="dxa"/>
           </w:tcPr>
           <w:p>
             <w:pPr>
@@ -6619,7 +6619,7 @@
         </w:tc>
         <w:tc>
           <w:tcPr>
-            <w:tcW w:w="1477" w:type="dxa"/>
+            <w:tcW w:w="1194" w:type="dxa"/>
           </w:tcPr>
           <w:p>
             <w:pPr>
@@ -6641,7 +6641,7 @@
         </w:tc>
         <w:tc>
           <w:tcPr>
-            <w:tcW w:w="820" w:type="dxa"/>
+            <w:tcW w:w="663" w:type="dxa"/>
           </w:tcPr>
           <w:p>
             <w:pPr>
@@ -6661,7 +6661,7 @@
         </w:trPr>
         <w:tc>
           <w:tcPr>
-            <w:tcW w:w="3939" w:type="dxa"/>
+            <w:tcW w:w="3185" w:type="dxa"/>
           </w:tcPr>
           <w:p>
             <w:pPr>
@@ -6683,29 +6683,29 @@
         </w:tc>
         <w:tc>
           <w:tcPr>
-            <w:tcW w:w="820" w:type="dxa"/>
-          </w:tcPr>
-          <w:p>
-            <w:pPr>
-              <w:pStyle w:val="Compact"/>
-              <w:jc w:val="left"/>
-              <w:rPr>
-                <w:sz w:val="16"/>
-                <w:szCs w:val="16"/>
-              </w:rPr>
-            </w:pPr>
-            <w:r>
-              <w:rPr>
-                <w:sz w:val="16"/>
-                <w:szCs w:val="16"/>
-              </w:rPr>
-              <w:t xml:space="preserve">shape</w:t>
-            </w:r>
-          </w:p>
-        </w:tc>
-        <w:tc>
-          <w:tcPr>
-            <w:tcW w:w="1231" w:type="dxa"/>
+            <w:tcW w:w="2455" w:type="dxa"/>
+          </w:tcPr>
+          <w:p>
+            <w:pPr>
+              <w:pStyle w:val="Compact"/>
+              <w:jc w:val="left"/>
+              <w:rPr>
+                <w:sz w:val="16"/>
+                <w:szCs w:val="16"/>
+              </w:rPr>
+            </w:pPr>
+            <w:r>
+              <w:rPr>
+                <w:sz w:val="16"/>
+                <w:szCs w:val="16"/>
+              </w:rPr>
+              <w:t xml:space="preserve">Terrain shape</w:t>
+            </w:r>
+          </w:p>
+        </w:tc>
+        <w:tc>
+          <w:tcPr>
+            <w:tcW w:w="995" w:type="dxa"/>
           </w:tcPr>
           <w:p>
             <w:pPr>
@@ -6727,7 +6727,7 @@
         </w:tc>
         <w:tc>
           <w:tcPr>
-            <w:tcW w:w="1067" w:type="dxa"/>
+            <w:tcW w:w="862" w:type="dxa"/>
           </w:tcPr>
           <w:p>
             <w:pPr>
@@ -6749,7 +6749,7 @@
         </w:tc>
         <w:tc>
           <w:tcPr>
-            <w:tcW w:w="1477" w:type="dxa"/>
+            <w:tcW w:w="1194" w:type="dxa"/>
           </w:tcPr>
           <w:p>
             <w:pPr>
@@ -6771,7 +6771,7 @@
         </w:tc>
         <w:tc>
           <w:tcPr>
-            <w:tcW w:w="820" w:type="dxa"/>
+            <w:tcW w:w="663" w:type="dxa"/>
           </w:tcPr>
           <w:p>
             <w:pPr>
@@ -6791,7 +6791,7 @@
         </w:trPr>
         <w:tc>
           <w:tcPr>
-            <w:tcW w:w="3939" w:type="dxa"/>
+            <w:tcW w:w="3185" w:type="dxa"/>
           </w:tcPr>
           <w:p>
             <w:pPr>
@@ -6813,29 +6813,29 @@
         </w:tc>
         <w:tc>
           <w:tcPr>
-            <w:tcW w:w="820" w:type="dxa"/>
-          </w:tcPr>
-          <w:p>
-            <w:pPr>
-              <w:pStyle w:val="Compact"/>
-              <w:jc w:val="left"/>
-              <w:rPr>
-                <w:sz w:val="16"/>
-                <w:szCs w:val="16"/>
-              </w:rPr>
-            </w:pPr>
-            <w:r>
-              <w:rPr>
-                <w:sz w:val="16"/>
-                <w:szCs w:val="16"/>
-              </w:rPr>
-              <w:t xml:space="preserve">wind_geo</w:t>
-            </w:r>
-          </w:p>
-        </w:tc>
-        <w:tc>
-          <w:tcPr>
-            <w:tcW w:w="1231" w:type="dxa"/>
+            <w:tcW w:w="2455" w:type="dxa"/>
+          </w:tcPr>
+          <w:p>
+            <w:pPr>
+              <w:pStyle w:val="Compact"/>
+              <w:jc w:val="left"/>
+              <w:rPr>
+                <w:sz w:val="16"/>
+                <w:szCs w:val="16"/>
+              </w:rPr>
+            </w:pPr>
+            <w:r>
+              <w:rPr>
+                <w:sz w:val="16"/>
+                <w:szCs w:val="16"/>
+              </w:rPr>
+              <w:t xml:space="preserve">Terrain exposure to wind</w:t>
+            </w:r>
+          </w:p>
+        </w:tc>
+        <w:tc>
+          <w:tcPr>
+            <w:tcW w:w="995" w:type="dxa"/>
           </w:tcPr>
           <w:p>
             <w:pPr>
@@ -6857,7 +6857,7 @@
         </w:tc>
         <w:tc>
           <w:tcPr>
-            <w:tcW w:w="1067" w:type="dxa"/>
+            <w:tcW w:w="862" w:type="dxa"/>
           </w:tcPr>
           <w:p>
             <w:pPr>
@@ -6879,7 +6879,7 @@
         </w:tc>
         <w:tc>
           <w:tcPr>
-            <w:tcW w:w="1477" w:type="dxa"/>
+            <w:tcW w:w="1194" w:type="dxa"/>
           </w:tcPr>
           <w:p>
             <w:pPr>
@@ -6901,7 +6901,7 @@
         </w:tc>
         <w:tc>
           <w:tcPr>
-            <w:tcW w:w="820" w:type="dxa"/>
+            <w:tcW w:w="663" w:type="dxa"/>
           </w:tcPr>
           <w:p>
             <w:pPr>
@@ -6921,7 +6921,7 @@
         </w:trPr>
         <w:tc>
           <w:tcPr>
-            <w:tcW w:w="3939" w:type="dxa"/>
+            <w:tcW w:w="3185" w:type="dxa"/>
           </w:tcPr>
           <w:p>
             <w:pPr>
@@ -6943,29 +6943,29 @@
         </w:tc>
         <w:tc>
           <w:tcPr>
-            <w:tcW w:w="820" w:type="dxa"/>
-          </w:tcPr>
-          <w:p>
-            <w:pPr>
-              <w:pStyle w:val="Compact"/>
-              <w:jc w:val="left"/>
-              <w:rPr>
-                <w:sz w:val="16"/>
-                <w:szCs w:val="16"/>
-              </w:rPr>
-            </w:pPr>
-            <w:r>
-              <w:rPr>
-                <w:sz w:val="16"/>
-                <w:szCs w:val="16"/>
-              </w:rPr>
-              <w:t xml:space="preserve">wind_geo</w:t>
-            </w:r>
-          </w:p>
-        </w:tc>
-        <w:tc>
-          <w:tcPr>
-            <w:tcW w:w="1231" w:type="dxa"/>
+            <w:tcW w:w="2455" w:type="dxa"/>
+          </w:tcPr>
+          <w:p>
+            <w:pPr>
+              <w:pStyle w:val="Compact"/>
+              <w:jc w:val="left"/>
+              <w:rPr>
+                <w:sz w:val="16"/>
+                <w:szCs w:val="16"/>
+              </w:rPr>
+            </w:pPr>
+            <w:r>
+              <w:rPr>
+                <w:sz w:val="16"/>
+                <w:szCs w:val="16"/>
+              </w:rPr>
+              <w:t xml:space="preserve">Terrain exposure to wind</w:t>
+            </w:r>
+          </w:p>
+        </w:tc>
+        <w:tc>
+          <w:tcPr>
+            <w:tcW w:w="995" w:type="dxa"/>
           </w:tcPr>
           <w:p>
             <w:pPr>
@@ -6987,7 +6987,7 @@
         </w:tc>
         <w:tc>
           <w:tcPr>
-            <w:tcW w:w="1067" w:type="dxa"/>
+            <w:tcW w:w="862" w:type="dxa"/>
           </w:tcPr>
           <w:p>
             <w:pPr>
@@ -7009,7 +7009,7 @@
         </w:tc>
         <w:tc>
           <w:tcPr>
-            <w:tcW w:w="1477" w:type="dxa"/>
+            <w:tcW w:w="1194" w:type="dxa"/>
           </w:tcPr>
           <w:p>
             <w:pPr>
@@ -7031,7 +7031,7 @@
         </w:tc>
         <w:tc>
           <w:tcPr>
-            <w:tcW w:w="820" w:type="dxa"/>
+            <w:tcW w:w="663" w:type="dxa"/>
           </w:tcPr>
           <w:p>
             <w:pPr>
@@ -7051,7 +7051,7 @@
         </w:trPr>
         <w:tc>
           <w:tcPr>
-            <w:tcW w:w="3939" w:type="dxa"/>
+            <w:tcW w:w="3185" w:type="dxa"/>
           </w:tcPr>
           <w:p>
             <w:pPr>
@@ -7073,29 +7073,29 @@
         </w:tc>
         <w:tc>
           <w:tcPr>
-            <w:tcW w:w="820" w:type="dxa"/>
-          </w:tcPr>
-          <w:p>
-            <w:pPr>
-              <w:pStyle w:val="Compact"/>
-              <w:jc w:val="left"/>
-              <w:rPr>
-                <w:sz w:val="16"/>
-                <w:szCs w:val="16"/>
-              </w:rPr>
-            </w:pPr>
-            <w:r>
-              <w:rPr>
-                <w:sz w:val="16"/>
-                <w:szCs w:val="16"/>
-              </w:rPr>
-              <w:t xml:space="preserve">density</w:t>
-            </w:r>
-          </w:p>
-        </w:tc>
-        <w:tc>
-          <w:tcPr>
-            <w:tcW w:w="1231" w:type="dxa"/>
+            <w:tcW w:w="2455" w:type="dxa"/>
+          </w:tcPr>
+          <w:p>
+            <w:pPr>
+              <w:pStyle w:val="Compact"/>
+              <w:jc w:val="left"/>
+              <w:rPr>
+                <w:sz w:val="16"/>
+                <w:szCs w:val="16"/>
+              </w:rPr>
+            </w:pPr>
+            <w:r>
+              <w:rPr>
+                <w:sz w:val="16"/>
+                <w:szCs w:val="16"/>
+              </w:rPr>
+              <w:t xml:space="preserve">Stand density</w:t>
+            </w:r>
+          </w:p>
+        </w:tc>
+        <w:tc>
+          <w:tcPr>
+            <w:tcW w:w="995" w:type="dxa"/>
           </w:tcPr>
           <w:p>
             <w:pPr>
@@ -7117,7 +7117,7 @@
         </w:tc>
         <w:tc>
           <w:tcPr>
-            <w:tcW w:w="1067" w:type="dxa"/>
+            <w:tcW w:w="862" w:type="dxa"/>
           </w:tcPr>
           <w:p>
             <w:pPr>
@@ -7139,7 +7139,7 @@
         </w:tc>
         <w:tc>
           <w:tcPr>
-            <w:tcW w:w="1477" w:type="dxa"/>
+            <w:tcW w:w="1194" w:type="dxa"/>
           </w:tcPr>
           <w:p>
             <w:pPr>
@@ -7161,7 +7161,7 @@
         </w:tc>
         <w:tc>
           <w:tcPr>
-            <w:tcW w:w="820" w:type="dxa"/>
+            <w:tcW w:w="663" w:type="dxa"/>
           </w:tcPr>
           <w:p>
             <w:pPr>
@@ -7181,7 +7181,7 @@
         </w:trPr>
         <w:tc>
           <w:tcPr>
-            <w:tcW w:w="3939" w:type="dxa"/>
+            <w:tcW w:w="3185" w:type="dxa"/>
           </w:tcPr>
           <w:p>
             <w:pPr>
@@ -7203,29 +7203,29 @@
         </w:tc>
         <w:tc>
           <w:tcPr>
-            <w:tcW w:w="820" w:type="dxa"/>
-          </w:tcPr>
-          <w:p>
-            <w:pPr>
-              <w:pStyle w:val="Compact"/>
-              <w:jc w:val="left"/>
-              <w:rPr>
-                <w:sz w:val="16"/>
-                <w:szCs w:val="16"/>
-              </w:rPr>
-            </w:pPr>
-            <w:r>
-              <w:rPr>
-                <w:sz w:val="16"/>
-                <w:szCs w:val="16"/>
-              </w:rPr>
-              <w:t xml:space="preserve">wind_t</w:t>
-            </w:r>
-          </w:p>
-        </w:tc>
-        <w:tc>
-          <w:tcPr>
-            <w:tcW w:w="1231" w:type="dxa"/>
+            <w:tcW w:w="2455" w:type="dxa"/>
+          </w:tcPr>
+          <w:p>
+            <w:pPr>
+              <w:pStyle w:val="Compact"/>
+              <w:jc w:val="left"/>
+              <w:rPr>
+                <w:sz w:val="16"/>
+                <w:szCs w:val="16"/>
+              </w:rPr>
+            </w:pPr>
+            <w:r>
+              <w:rPr>
+                <w:sz w:val="16"/>
+                <w:szCs w:val="16"/>
+              </w:rPr>
+              <w:t xml:space="preserve">Flight-window wind, stations</w:t>
+            </w:r>
+          </w:p>
+        </w:tc>
+        <w:tc>
+          <w:tcPr>
+            <w:tcW w:w="995" w:type="dxa"/>
           </w:tcPr>
           <w:p>
             <w:pPr>
@@ -7247,7 +7247,7 @@
         </w:tc>
         <w:tc>
           <w:tcPr>
-            <w:tcW w:w="1067" w:type="dxa"/>
+            <w:tcW w:w="862" w:type="dxa"/>
           </w:tcPr>
           <w:p>
             <w:pPr>
@@ -7269,7 +7269,7 @@
         </w:tc>
         <w:tc>
           <w:tcPr>
-            <w:tcW w:w="1477" w:type="dxa"/>
+            <w:tcW w:w="1194" w:type="dxa"/>
           </w:tcPr>
           <w:p>
             <w:pPr>
@@ -7291,7 +7291,7 @@
         </w:tc>
         <w:tc>
           <w:tcPr>
-            <w:tcW w:w="820" w:type="dxa"/>
+            <w:tcW w:w="663" w:type="dxa"/>
           </w:tcPr>
           <w:p>
             <w:pPr>
@@ -7311,7 +7311,7 @@
         </w:trPr>
         <w:tc>
           <w:tcPr>
-            <w:tcW w:w="3939" w:type="dxa"/>
+            <w:tcW w:w="3185" w:type="dxa"/>
           </w:tcPr>
           <w:p>
             <w:pPr>
@@ -7333,29 +7333,29 @@
         </w:tc>
         <w:tc>
           <w:tcPr>
-            <w:tcW w:w="820" w:type="dxa"/>
-          </w:tcPr>
-          <w:p>
-            <w:pPr>
-              <w:pStyle w:val="Compact"/>
-              <w:jc w:val="left"/>
-              <w:rPr>
-                <w:sz w:val="16"/>
-                <w:szCs w:val="16"/>
-              </w:rPr>
-            </w:pPr>
-            <w:r>
-              <w:rPr>
-                <w:sz w:val="16"/>
-                <w:szCs w:val="16"/>
-              </w:rPr>
-              <w:t xml:space="preserve">wind_t</w:t>
-            </w:r>
-          </w:p>
-        </w:tc>
-        <w:tc>
-          <w:tcPr>
-            <w:tcW w:w="1231" w:type="dxa"/>
+            <w:tcW w:w="2455" w:type="dxa"/>
+          </w:tcPr>
+          <w:p>
+            <w:pPr>
+              <w:pStyle w:val="Compact"/>
+              <w:jc w:val="left"/>
+              <w:rPr>
+                <w:sz w:val="16"/>
+                <w:szCs w:val="16"/>
+              </w:rPr>
+            </w:pPr>
+            <w:r>
+              <w:rPr>
+                <w:sz w:val="16"/>
+                <w:szCs w:val="16"/>
+              </w:rPr>
+              <w:t xml:space="preserve">Flight-window wind, stations</w:t>
+            </w:r>
+          </w:p>
+        </w:tc>
+        <w:tc>
+          <w:tcPr>
+            <w:tcW w:w="995" w:type="dxa"/>
           </w:tcPr>
           <w:p>
             <w:pPr>
@@ -7377,7 +7377,7 @@
         </w:tc>
         <w:tc>
           <w:tcPr>
-            <w:tcW w:w="1067" w:type="dxa"/>
+            <w:tcW w:w="862" w:type="dxa"/>
           </w:tcPr>
           <w:p>
             <w:pPr>
@@ -7399,7 +7399,7 @@
         </w:tc>
         <w:tc>
           <w:tcPr>
-            <w:tcW w:w="1477" w:type="dxa"/>
+            <w:tcW w:w="1194" w:type="dxa"/>
           </w:tcPr>
           <w:p>
             <w:pPr>
@@ -7421,7 +7421,7 @@
         </w:tc>
         <w:tc>
           <w:tcPr>
-            <w:tcW w:w="820" w:type="dxa"/>
+            <w:tcW w:w="663" w:type="dxa"/>
           </w:tcPr>
           <w:p>
             <w:pPr>
@@ -7441,7 +7441,7 @@
         </w:trPr>
         <w:tc>
           <w:tcPr>
-            <w:tcW w:w="3939" w:type="dxa"/>
+            <w:tcW w:w="3185" w:type="dxa"/>
           </w:tcPr>
           <w:p>
             <w:pPr>
@@ -7463,29 +7463,29 @@
         </w:tc>
         <w:tc>
           <w:tcPr>
-            <w:tcW w:w="820" w:type="dxa"/>
-          </w:tcPr>
-          <w:p>
-            <w:pPr>
-              <w:pStyle w:val="Compact"/>
-              <w:jc w:val="left"/>
-              <w:rPr>
-                <w:sz w:val="16"/>
-                <w:szCs w:val="16"/>
-              </w:rPr>
-            </w:pPr>
-            <w:r>
-              <w:rPr>
-                <w:sz w:val="16"/>
-                <w:szCs w:val="16"/>
-              </w:rPr>
-              <w:t xml:space="preserve">shape</w:t>
-            </w:r>
-          </w:p>
-        </w:tc>
-        <w:tc>
-          <w:tcPr>
-            <w:tcW w:w="1231" w:type="dxa"/>
+            <w:tcW w:w="2455" w:type="dxa"/>
+          </w:tcPr>
+          <w:p>
+            <w:pPr>
+              <w:pStyle w:val="Compact"/>
+              <w:jc w:val="left"/>
+              <w:rPr>
+                <w:sz w:val="16"/>
+                <w:szCs w:val="16"/>
+              </w:rPr>
+            </w:pPr>
+            <w:r>
+              <w:rPr>
+                <w:sz w:val="16"/>
+                <w:szCs w:val="16"/>
+              </w:rPr>
+              <w:t xml:space="preserve">Terrain shape</w:t>
+            </w:r>
+          </w:p>
+        </w:tc>
+        <w:tc>
+          <w:tcPr>
+            <w:tcW w:w="995" w:type="dxa"/>
           </w:tcPr>
           <w:p>
             <w:pPr>
@@ -7507,7 +7507,7 @@
         </w:tc>
         <w:tc>
           <w:tcPr>
-            <w:tcW w:w="1067" w:type="dxa"/>
+            <w:tcW w:w="862" w:type="dxa"/>
           </w:tcPr>
           <w:p>
             <w:pPr>
@@ -7529,7 +7529,7 @@
         </w:tc>
         <w:tc>
           <w:tcPr>
-            <w:tcW w:w="1477" w:type="dxa"/>
+            <w:tcW w:w="1194" w:type="dxa"/>
           </w:tcPr>
           <w:p>
             <w:pPr>
@@ -7551,7 +7551,7 @@
         </w:tc>
         <w:tc>
           <w:tcPr>
-            <w:tcW w:w="820" w:type="dxa"/>
+            <w:tcW w:w="663" w:type="dxa"/>
           </w:tcPr>
           <w:p>
             <w:pPr>
@@ -7571,7 +7571,7 @@
         </w:trPr>
         <w:tc>
           <w:tcPr>
-            <w:tcW w:w="3939" w:type="dxa"/>
+            <w:tcW w:w="3185" w:type="dxa"/>
           </w:tcPr>
           <w:p>
             <w:pPr>
@@ -7593,29 +7593,29 @@
         </w:tc>
         <w:tc>
           <w:tcPr>
-            <w:tcW w:w="820" w:type="dxa"/>
-          </w:tcPr>
-          <w:p>
-            <w:pPr>
-              <w:pStyle w:val="Compact"/>
-              <w:jc w:val="left"/>
-              <w:rPr>
-                <w:sz w:val="16"/>
-                <w:szCs w:val="16"/>
-              </w:rPr>
-            </w:pPr>
-            <w:r>
-              <w:rPr>
-                <w:sz w:val="16"/>
-                <w:szCs w:val="16"/>
-              </w:rPr>
-              <w:t xml:space="preserve">wind_t</w:t>
-            </w:r>
-          </w:p>
-        </w:tc>
-        <w:tc>
-          <w:tcPr>
-            <w:tcW w:w="1231" w:type="dxa"/>
+            <w:tcW w:w="2455" w:type="dxa"/>
+          </w:tcPr>
+          <w:p>
+            <w:pPr>
+              <w:pStyle w:val="Compact"/>
+              <w:jc w:val="left"/>
+              <w:rPr>
+                <w:sz w:val="16"/>
+                <w:szCs w:val="16"/>
+              </w:rPr>
+            </w:pPr>
+            <w:r>
+              <w:rPr>
+                <w:sz w:val="16"/>
+                <w:szCs w:val="16"/>
+              </w:rPr>
+              <w:t xml:space="preserve">Flight-window wind, stations</w:t>
+            </w:r>
+          </w:p>
+        </w:tc>
+        <w:tc>
+          <w:tcPr>
+            <w:tcW w:w="995" w:type="dxa"/>
           </w:tcPr>
           <w:p>
             <w:pPr>
@@ -7637,7 +7637,7 @@
         </w:tc>
         <w:tc>
           <w:tcPr>
-            <w:tcW w:w="1067" w:type="dxa"/>
+            <w:tcW w:w="862" w:type="dxa"/>
           </w:tcPr>
           <w:p>
             <w:pPr>
@@ -7659,7 +7659,7 @@
         </w:tc>
         <w:tc>
           <w:tcPr>
-            <w:tcW w:w="1477" w:type="dxa"/>
+            <w:tcW w:w="1194" w:type="dxa"/>
           </w:tcPr>
           <w:p>
             <w:pPr>
@@ -7681,7 +7681,7 @@
         </w:tc>
         <w:tc>
           <w:tcPr>
-            <w:tcW w:w="820" w:type="dxa"/>
+            <w:tcW w:w="663" w:type="dxa"/>
           </w:tcPr>
           <w:p>
             <w:pPr>
@@ -7701,7 +7701,7 @@
         </w:trPr>
         <w:tc>
           <w:tcPr>
-            <w:tcW w:w="3939" w:type="dxa"/>
+            <w:tcW w:w="3185" w:type="dxa"/>
           </w:tcPr>
           <w:p>
             <w:pPr>
@@ -7723,29 +7723,29 @@
         </w:tc>
         <w:tc>
           <w:tcPr>
-            <w:tcW w:w="820" w:type="dxa"/>
-          </w:tcPr>
-          <w:p>
-            <w:pPr>
-              <w:pStyle w:val="Compact"/>
-              <w:jc w:val="left"/>
-              <w:rPr>
-                <w:sz w:val="16"/>
-                <w:szCs w:val="16"/>
-              </w:rPr>
-            </w:pPr>
-            <w:r>
-              <w:rPr>
-                <w:sz w:val="16"/>
-                <w:szCs w:val="16"/>
-              </w:rPr>
-              <w:t xml:space="preserve">shape</w:t>
-            </w:r>
-          </w:p>
-        </w:tc>
-        <w:tc>
-          <w:tcPr>
-            <w:tcW w:w="1231" w:type="dxa"/>
+            <w:tcW w:w="2455" w:type="dxa"/>
+          </w:tcPr>
+          <w:p>
+            <w:pPr>
+              <w:pStyle w:val="Compact"/>
+              <w:jc w:val="left"/>
+              <w:rPr>
+                <w:sz w:val="16"/>
+                <w:szCs w:val="16"/>
+              </w:rPr>
+            </w:pPr>
+            <w:r>
+              <w:rPr>
+                <w:sz w:val="16"/>
+                <w:szCs w:val="16"/>
+              </w:rPr>
+              <w:t xml:space="preserve">Terrain shape</w:t>
+            </w:r>
+          </w:p>
+        </w:tc>
+        <w:tc>
+          <w:tcPr>
+            <w:tcW w:w="995" w:type="dxa"/>
           </w:tcPr>
           <w:p>
             <w:pPr>
@@ -7767,7 +7767,7 @@
         </w:tc>
         <w:tc>
           <w:tcPr>
-            <w:tcW w:w="1067" w:type="dxa"/>
+            <w:tcW w:w="862" w:type="dxa"/>
           </w:tcPr>
           <w:p>
             <w:pPr>
@@ -7789,7 +7789,7 @@
         </w:tc>
         <w:tc>
           <w:tcPr>
-            <w:tcW w:w="1477" w:type="dxa"/>
+            <w:tcW w:w="1194" w:type="dxa"/>
           </w:tcPr>
           <w:p>
             <w:pPr>
@@ -7811,7 +7811,7 @@
         </w:tc>
         <w:tc>
           <w:tcPr>
-            <w:tcW w:w="820" w:type="dxa"/>
+            <w:tcW w:w="663" w:type="dxa"/>
           </w:tcPr>
           <w:p>
             <w:pPr>
@@ -7831,7 +7831,7 @@
         </w:trPr>
         <w:tc>
           <w:tcPr>
-            <w:tcW w:w="3939" w:type="dxa"/>
+            <w:tcW w:w="3185" w:type="dxa"/>
           </w:tcPr>
           <w:p>
             <w:pPr>
@@ -7853,29 +7853,29 @@
         </w:tc>
         <w:tc>
           <w:tcPr>
-            <w:tcW w:w="820" w:type="dxa"/>
-          </w:tcPr>
-          <w:p>
-            <w:pPr>
-              <w:pStyle w:val="Compact"/>
-              <w:jc w:val="left"/>
-              <w:rPr>
-                <w:sz w:val="16"/>
-                <w:szCs w:val="16"/>
-              </w:rPr>
-            </w:pPr>
-            <w:r>
-              <w:rPr>
-                <w:sz w:val="16"/>
-                <w:szCs w:val="16"/>
-              </w:rPr>
-              <w:t xml:space="preserve">flightsun</w:t>
-            </w:r>
-          </w:p>
-        </w:tc>
-        <w:tc>
-          <w:tcPr>
-            <w:tcW w:w="1231" w:type="dxa"/>
+            <w:tcW w:w="2455" w:type="dxa"/>
+          </w:tcPr>
+          <w:p>
+            <w:pPr>
+              <w:pStyle w:val="Compact"/>
+              <w:jc w:val="left"/>
+              <w:rPr>
+                <w:sz w:val="16"/>
+                <w:szCs w:val="16"/>
+              </w:rPr>
+            </w:pPr>
+            <w:r>
+              <w:rPr>
+                <w:sz w:val="16"/>
+                <w:szCs w:val="16"/>
+              </w:rPr>
+              <w:t xml:space="preserve">Flight-window radiation</w:t>
+            </w:r>
+          </w:p>
+        </w:tc>
+        <w:tc>
+          <w:tcPr>
+            <w:tcW w:w="995" w:type="dxa"/>
           </w:tcPr>
           <w:p>
             <w:pPr>
@@ -7897,7 +7897,7 @@
         </w:tc>
         <w:tc>
           <w:tcPr>
-            <w:tcW w:w="1067" w:type="dxa"/>
+            <w:tcW w:w="862" w:type="dxa"/>
           </w:tcPr>
           <w:p>
             <w:pPr>
@@ -7919,7 +7919,7 @@
         </w:tc>
         <w:tc>
           <w:tcPr>
-            <w:tcW w:w="1477" w:type="dxa"/>
+            <w:tcW w:w="1194" w:type="dxa"/>
           </w:tcPr>
           <w:p>
             <w:pPr>
@@ -7941,7 +7941,7 @@
         </w:tc>
         <w:tc>
           <w:tcPr>
-            <w:tcW w:w="820" w:type="dxa"/>
+            <w:tcW w:w="663" w:type="dxa"/>
           </w:tcPr>
           <w:p>
             <w:pPr>
@@ -7961,7 +7961,7 @@
         </w:trPr>
         <w:tc>
           <w:tcPr>
-            <w:tcW w:w="3939" w:type="dxa"/>
+            <w:tcW w:w="3185" w:type="dxa"/>
           </w:tcPr>
           <w:p>
             <w:pPr>
@@ -7983,29 +7983,29 @@
         </w:tc>
         <w:tc>
           <w:tcPr>
-            <w:tcW w:w="820" w:type="dxa"/>
-          </w:tcPr>
-          <w:p>
-            <w:pPr>
-              <w:pStyle w:val="Compact"/>
-              <w:jc w:val="left"/>
-              <w:rPr>
-                <w:sz w:val="16"/>
-                <w:szCs w:val="16"/>
-              </w:rPr>
-            </w:pPr>
-            <w:r>
-              <w:rPr>
-                <w:sz w:val="16"/>
-                <w:szCs w:val="16"/>
-              </w:rPr>
-              <w:t xml:space="preserve">wind_geo</w:t>
-            </w:r>
-          </w:p>
-        </w:tc>
-        <w:tc>
-          <w:tcPr>
-            <w:tcW w:w="1231" w:type="dxa"/>
+            <w:tcW w:w="2455" w:type="dxa"/>
+          </w:tcPr>
+          <w:p>
+            <w:pPr>
+              <w:pStyle w:val="Compact"/>
+              <w:jc w:val="left"/>
+              <w:rPr>
+                <w:sz w:val="16"/>
+                <w:szCs w:val="16"/>
+              </w:rPr>
+            </w:pPr>
+            <w:r>
+              <w:rPr>
+                <w:sz w:val="16"/>
+                <w:szCs w:val="16"/>
+              </w:rPr>
+              <w:t xml:space="preserve">Terrain exposure to wind</w:t>
+            </w:r>
+          </w:p>
+        </w:tc>
+        <w:tc>
+          <w:tcPr>
+            <w:tcW w:w="995" w:type="dxa"/>
           </w:tcPr>
           <w:p>
             <w:pPr>
@@ -8027,7 +8027,7 @@
         </w:tc>
         <w:tc>
           <w:tcPr>
-            <w:tcW w:w="1067" w:type="dxa"/>
+            <w:tcW w:w="862" w:type="dxa"/>
           </w:tcPr>
           <w:p>
             <w:pPr>
@@ -8049,7 +8049,7 @@
         </w:tc>
         <w:tc>
           <w:tcPr>
-            <w:tcW w:w="1477" w:type="dxa"/>
+            <w:tcW w:w="1194" w:type="dxa"/>
           </w:tcPr>
           <w:p>
             <w:pPr>
@@ -8071,7 +8071,7 @@
         </w:tc>
         <w:tc>
           <w:tcPr>
-            <w:tcW w:w="820" w:type="dxa"/>
+            <w:tcW w:w="663" w:type="dxa"/>
           </w:tcPr>
           <w:p>
             <w:pPr>
@@ -8091,7 +8091,7 @@
         </w:trPr>
         <w:tc>
           <w:tcPr>
-            <w:tcW w:w="3939" w:type="dxa"/>
+            <w:tcW w:w="3185" w:type="dxa"/>
           </w:tcPr>
           <w:p>
             <w:pPr>
@@ -8113,29 +8113,29 @@
         </w:tc>
         <w:tc>
           <w:tcPr>
-            <w:tcW w:w="820" w:type="dxa"/>
-          </w:tcPr>
-          <w:p>
-            <w:pPr>
-              <w:pStyle w:val="Compact"/>
-              <w:jc w:val="left"/>
-              <w:rPr>
-                <w:sz w:val="16"/>
-                <w:szCs w:val="16"/>
-              </w:rPr>
-            </w:pPr>
-            <w:r>
-              <w:rPr>
-                <w:sz w:val="16"/>
-                <w:szCs w:val="16"/>
-              </w:rPr>
-              <w:t xml:space="preserve">shading</w:t>
-            </w:r>
-          </w:p>
-        </w:tc>
-        <w:tc>
-          <w:tcPr>
-            <w:tcW w:w="1231" w:type="dxa"/>
+            <w:tcW w:w="2455" w:type="dxa"/>
+          </w:tcPr>
+          <w:p>
+            <w:pPr>
+              <w:pStyle w:val="Compact"/>
+              <w:jc w:val="left"/>
+              <w:rPr>
+                <w:sz w:val="16"/>
+                <w:szCs w:val="16"/>
+              </w:rPr>
+            </w:pPr>
+            <w:r>
+              <w:rPr>
+                <w:sz w:val="16"/>
+                <w:szCs w:val="16"/>
+              </w:rPr>
+              <w:t xml:space="preserve">Topographic shading</w:t>
+            </w:r>
+          </w:p>
+        </w:tc>
+        <w:tc>
+          <w:tcPr>
+            <w:tcW w:w="995" w:type="dxa"/>
           </w:tcPr>
           <w:p>
             <w:pPr>
@@ -8157,7 +8157,7 @@
         </w:tc>
         <w:tc>
           <w:tcPr>
-            <w:tcW w:w="1067" w:type="dxa"/>
+            <w:tcW w:w="862" w:type="dxa"/>
           </w:tcPr>
           <w:p>
             <w:pPr>
@@ -8179,7 +8179,7 @@
         </w:tc>
         <w:tc>
           <w:tcPr>
-            <w:tcW w:w="1477" w:type="dxa"/>
+            <w:tcW w:w="1194" w:type="dxa"/>
           </w:tcPr>
           <w:p>
             <w:pPr>
@@ -8201,7 +8201,7 @@
         </w:tc>
         <w:tc>
           <w:tcPr>
-            <w:tcW w:w="820" w:type="dxa"/>
+            <w:tcW w:w="663" w:type="dxa"/>
           </w:tcPr>
           <w:p>
             <w:pPr>
@@ -8221,7 +8221,7 @@
         </w:trPr>
         <w:tc>
           <w:tcPr>
-            <w:tcW w:w="3939" w:type="dxa"/>
+            <w:tcW w:w="3185" w:type="dxa"/>
           </w:tcPr>
           <w:p>
             <w:pPr>
@@ -8243,29 +8243,29 @@
         </w:tc>
         <w:tc>
           <w:tcPr>
-            <w:tcW w:w="820" w:type="dxa"/>
-          </w:tcPr>
-          <w:p>
-            <w:pPr>
-              <w:pStyle w:val="Compact"/>
-              <w:jc w:val="left"/>
-              <w:rPr>
-                <w:sz w:val="16"/>
-                <w:szCs w:val="16"/>
-              </w:rPr>
-            </w:pPr>
-            <w:r>
-              <w:rPr>
-                <w:sz w:val="16"/>
-                <w:szCs w:val="16"/>
-              </w:rPr>
-              <w:t xml:space="preserve">shading</w:t>
-            </w:r>
-          </w:p>
-        </w:tc>
-        <w:tc>
-          <w:tcPr>
-            <w:tcW w:w="1231" w:type="dxa"/>
+            <w:tcW w:w="2455" w:type="dxa"/>
+          </w:tcPr>
+          <w:p>
+            <w:pPr>
+              <w:pStyle w:val="Compact"/>
+              <w:jc w:val="left"/>
+              <w:rPr>
+                <w:sz w:val="16"/>
+                <w:szCs w:val="16"/>
+              </w:rPr>
+            </w:pPr>
+            <w:r>
+              <w:rPr>
+                <w:sz w:val="16"/>
+                <w:szCs w:val="16"/>
+              </w:rPr>
+              <w:t xml:space="preserve">Topographic shading</w:t>
+            </w:r>
+          </w:p>
+        </w:tc>
+        <w:tc>
+          <w:tcPr>
+            <w:tcW w:w="995" w:type="dxa"/>
           </w:tcPr>
           <w:p>
             <w:pPr>
@@ -8287,7 +8287,7 @@
         </w:tc>
         <w:tc>
           <w:tcPr>
-            <w:tcW w:w="1067" w:type="dxa"/>
+            <w:tcW w:w="862" w:type="dxa"/>
           </w:tcPr>
           <w:p>
             <w:pPr>
@@ -8309,7 +8309,7 @@
         </w:tc>
         <w:tc>
           <w:tcPr>
-            <w:tcW w:w="1477" w:type="dxa"/>
+            <w:tcW w:w="1194" w:type="dxa"/>
           </w:tcPr>
           <w:p>
             <w:pPr>
@@ -8331,7 +8331,7 @@
         </w:tc>
         <w:tc>
           <w:tcPr>
-            <w:tcW w:w="820" w:type="dxa"/>
+            <w:tcW w:w="663" w:type="dxa"/>
           </w:tcPr>
           <w:p>
             <w:pPr>
@@ -8351,7 +8351,7 @@
         </w:trPr>
         <w:tc>
           <w:tcPr>
-            <w:tcW w:w="3939" w:type="dxa"/>
+            <w:tcW w:w="3185" w:type="dxa"/>
           </w:tcPr>
           <w:p>
             <w:pPr>
@@ -8373,29 +8373,29 @@
         </w:tc>
         <w:tc>
           <w:tcPr>
-            <w:tcW w:w="820" w:type="dxa"/>
-          </w:tcPr>
-          <w:p>
-            <w:pPr>
-              <w:pStyle w:val="Compact"/>
-              <w:jc w:val="left"/>
-              <w:rPr>
-                <w:sz w:val="16"/>
-                <w:szCs w:val="16"/>
-              </w:rPr>
-            </w:pPr>
-            <w:r>
-              <w:rPr>
-                <w:sz w:val="16"/>
-                <w:szCs w:val="16"/>
-              </w:rPr>
-              <w:t xml:space="preserve">wind_t</w:t>
-            </w:r>
-          </w:p>
-        </w:tc>
-        <w:tc>
-          <w:tcPr>
-            <w:tcW w:w="1231" w:type="dxa"/>
+            <w:tcW w:w="2455" w:type="dxa"/>
+          </w:tcPr>
+          <w:p>
+            <w:pPr>
+              <w:pStyle w:val="Compact"/>
+              <w:jc w:val="left"/>
+              <w:rPr>
+                <w:sz w:val="16"/>
+                <w:szCs w:val="16"/>
+              </w:rPr>
+            </w:pPr>
+            <w:r>
+              <w:rPr>
+                <w:sz w:val="16"/>
+                <w:szCs w:val="16"/>
+              </w:rPr>
+              <w:t xml:space="preserve">Flight-window wind, stations</w:t>
+            </w:r>
+          </w:p>
+        </w:tc>
+        <w:tc>
+          <w:tcPr>
+            <w:tcW w:w="995" w:type="dxa"/>
           </w:tcPr>
           <w:p>
             <w:pPr>
@@ -8417,7 +8417,7 @@
         </w:tc>
         <w:tc>
           <w:tcPr>
-            <w:tcW w:w="1067" w:type="dxa"/>
+            <w:tcW w:w="862" w:type="dxa"/>
           </w:tcPr>
           <w:p>
             <w:pPr>
@@ -8439,7 +8439,7 @@
         </w:tc>
         <w:tc>
           <w:tcPr>
-            <w:tcW w:w="1477" w:type="dxa"/>
+            <w:tcW w:w="1194" w:type="dxa"/>
           </w:tcPr>
           <w:p>
             <w:pPr>
@@ -8461,7 +8461,7 @@
         </w:tc>
         <w:tc>
           <w:tcPr>
-            <w:tcW w:w="820" w:type="dxa"/>
+            <w:tcW w:w="663" w:type="dxa"/>
           </w:tcPr>
           <w:p>
             <w:pPr>
@@ -8481,7 +8481,7 @@
         </w:trPr>
         <w:tc>
           <w:tcPr>
-            <w:tcW w:w="3939" w:type="dxa"/>
+            <w:tcW w:w="3185" w:type="dxa"/>
           </w:tcPr>
           <w:p>
             <w:pPr>
@@ -8503,29 +8503,29 @@
         </w:tc>
         <w:tc>
           <w:tcPr>
-            <w:tcW w:w="820" w:type="dxa"/>
-          </w:tcPr>
-          <w:p>
-            <w:pPr>
-              <w:pStyle w:val="Compact"/>
-              <w:jc w:val="left"/>
-              <w:rPr>
-                <w:sz w:val="16"/>
-                <w:szCs w:val="16"/>
-              </w:rPr>
-            </w:pPr>
-            <w:r>
-              <w:rPr>
-                <w:sz w:val="16"/>
-                <w:szCs w:val="16"/>
-              </w:rPr>
-              <w:t xml:space="preserve">hostsize</w:t>
-            </w:r>
-          </w:p>
-        </w:tc>
-        <w:tc>
-          <w:tcPr>
-            <w:tcW w:w="1231" w:type="dxa"/>
+            <w:tcW w:w="2455" w:type="dxa"/>
+          </w:tcPr>
+          <w:p>
+            <w:pPr>
+              <w:pStyle w:val="Compact"/>
+              <w:jc w:val="left"/>
+              <w:rPr>
+                <w:sz w:val="16"/>
+                <w:szCs w:val="16"/>
+              </w:rPr>
+            </w:pPr>
+            <w:r>
+              <w:rPr>
+                <w:sz w:val="16"/>
+                <w:szCs w:val="16"/>
+              </w:rPr>
+              <w:t xml:space="preserve">Host size</w:t>
+            </w:r>
+          </w:p>
+        </w:tc>
+        <w:tc>
+          <w:tcPr>
+            <w:tcW w:w="995" w:type="dxa"/>
           </w:tcPr>
           <w:p>
             <w:pPr>
@@ -8547,7 +8547,7 @@
         </w:tc>
         <w:tc>
           <w:tcPr>
-            <w:tcW w:w="1067" w:type="dxa"/>
+            <w:tcW w:w="862" w:type="dxa"/>
           </w:tcPr>
           <w:p>
             <w:pPr>
@@ -8569,7 +8569,7 @@
         </w:tc>
         <w:tc>
           <w:tcPr>
-            <w:tcW w:w="1477" w:type="dxa"/>
+            <w:tcW w:w="1194" w:type="dxa"/>
           </w:tcPr>
           <w:p>
             <w:pPr>
@@ -8591,7 +8591,7 @@
         </w:tc>
         <w:tc>
           <w:tcPr>
-            <w:tcW w:w="820" w:type="dxa"/>
+            <w:tcW w:w="663" w:type="dxa"/>
           </w:tcPr>
           <w:p>
             <w:pPr>
@@ -8611,7 +8611,7 @@
         </w:trPr>
         <w:tc>
           <w:tcPr>
-            <w:tcW w:w="3939" w:type="dxa"/>
+            <w:tcW w:w="3185" w:type="dxa"/>
           </w:tcPr>
           <w:p>
             <w:pPr>
@@ -8633,29 +8633,29 @@
         </w:tc>
         <w:tc>
           <w:tcPr>
-            <w:tcW w:w="820" w:type="dxa"/>
-          </w:tcPr>
-          <w:p>
-            <w:pPr>
-              <w:pStyle w:val="Compact"/>
-              <w:jc w:val="left"/>
-              <w:rPr>
-                <w:sz w:val="16"/>
-                <w:szCs w:val="16"/>
-              </w:rPr>
-            </w:pPr>
-            <w:r>
-              <w:rPr>
-                <w:sz w:val="16"/>
-                <w:szCs w:val="16"/>
-              </w:rPr>
-              <w:t xml:space="preserve">landform</w:t>
-            </w:r>
-          </w:p>
-        </w:tc>
-        <w:tc>
-          <w:tcPr>
-            <w:tcW w:w="1231" w:type="dxa"/>
+            <w:tcW w:w="2455" w:type="dxa"/>
+          </w:tcPr>
+          <w:p>
+            <w:pPr>
+              <w:pStyle w:val="Compact"/>
+              <w:jc w:val="left"/>
+              <w:rPr>
+                <w:sz w:val="16"/>
+                <w:szCs w:val="16"/>
+              </w:rPr>
+            </w:pPr>
+            <w:r>
+              <w:rPr>
+                <w:sz w:val="16"/>
+                <w:szCs w:val="16"/>
+              </w:rPr>
+              <w:t xml:space="preserve">Landform</w:t>
+            </w:r>
+          </w:p>
+        </w:tc>
+        <w:tc>
+          <w:tcPr>
+            <w:tcW w:w="995" w:type="dxa"/>
           </w:tcPr>
           <w:p>
             <w:pPr>
@@ -8677,7 +8677,7 @@
         </w:tc>
         <w:tc>
           <w:tcPr>
-            <w:tcW w:w="1067" w:type="dxa"/>
+            <w:tcW w:w="862" w:type="dxa"/>
           </w:tcPr>
           <w:p>
             <w:pPr>
@@ -8699,7 +8699,7 @@
         </w:tc>
         <w:tc>
           <w:tcPr>
-            <w:tcW w:w="1477" w:type="dxa"/>
+            <w:tcW w:w="1194" w:type="dxa"/>
           </w:tcPr>
           <w:p>
             <w:pPr>
@@ -8721,7 +8721,7 @@
         </w:tc>
         <w:tc>
           <w:tcPr>
-            <w:tcW w:w="820" w:type="dxa"/>
+            <w:tcW w:w="663" w:type="dxa"/>
           </w:tcPr>
           <w:p>
             <w:pPr>
@@ -8741,7 +8741,7 @@
         </w:trPr>
         <w:tc>
           <w:tcPr>
-            <w:tcW w:w="3939" w:type="dxa"/>
+            <w:tcW w:w="3185" w:type="dxa"/>
           </w:tcPr>
           <w:p>
             <w:pPr>
@@ -8763,29 +8763,29 @@
         </w:tc>
         <w:tc>
           <w:tcPr>
-            <w:tcW w:w="820" w:type="dxa"/>
-          </w:tcPr>
-          <w:p>
-            <w:pPr>
-              <w:pStyle w:val="Compact"/>
-              <w:jc w:val="left"/>
-              <w:rPr>
-                <w:sz w:val="16"/>
-                <w:szCs w:val="16"/>
-              </w:rPr>
-            </w:pPr>
-            <w:r>
-              <w:rPr>
-                <w:sz w:val="16"/>
-                <w:szCs w:val="16"/>
-              </w:rPr>
-              <w:t xml:space="preserve">wind_geo</w:t>
-            </w:r>
-          </w:p>
-        </w:tc>
-        <w:tc>
-          <w:tcPr>
-            <w:tcW w:w="1231" w:type="dxa"/>
+            <w:tcW w:w="2455" w:type="dxa"/>
+          </w:tcPr>
+          <w:p>
+            <w:pPr>
+              <w:pStyle w:val="Compact"/>
+              <w:jc w:val="left"/>
+              <w:rPr>
+                <w:sz w:val="16"/>
+                <w:szCs w:val="16"/>
+              </w:rPr>
+            </w:pPr>
+            <w:r>
+              <w:rPr>
+                <w:sz w:val="16"/>
+                <w:szCs w:val="16"/>
+              </w:rPr>
+              <w:t xml:space="preserve">Terrain exposure to wind</w:t>
+            </w:r>
+          </w:p>
+        </w:tc>
+        <w:tc>
+          <w:tcPr>
+            <w:tcW w:w="995" w:type="dxa"/>
           </w:tcPr>
           <w:p>
             <w:pPr>
@@ -8807,7 +8807,7 @@
         </w:tc>
         <w:tc>
           <w:tcPr>
-            <w:tcW w:w="1067" w:type="dxa"/>
+            <w:tcW w:w="862" w:type="dxa"/>
           </w:tcPr>
           <w:p>
             <w:pPr>
@@ -8829,7 +8829,7 @@
         </w:tc>
         <w:tc>
           <w:tcPr>
-            <w:tcW w:w="1477" w:type="dxa"/>
+            <w:tcW w:w="1194" w:type="dxa"/>
           </w:tcPr>
           <w:p>
             <w:pPr>
@@ -8851,7 +8851,7 @@
         </w:tc>
         <w:tc>
           <w:tcPr>
-            <w:tcW w:w="820" w:type="dxa"/>
+            <w:tcW w:w="663" w:type="dxa"/>
           </w:tcPr>
           <w:p>
             <w:pPr>
@@ -8871,7 +8871,7 @@
         </w:trPr>
         <w:tc>
           <w:tcPr>
-            <w:tcW w:w="3939" w:type="dxa"/>
+            <w:tcW w:w="3185" w:type="dxa"/>
           </w:tcPr>
           <w:p>
             <w:pPr>
@@ -8893,29 +8893,29 @@
         </w:tc>
         <w:tc>
           <w:tcPr>
-            <w:tcW w:w="820" w:type="dxa"/>
-          </w:tcPr>
-          <w:p>
-            <w:pPr>
-              <w:pStyle w:val="Compact"/>
-              <w:jc w:val="left"/>
-              <w:rPr>
-                <w:sz w:val="16"/>
-                <w:szCs w:val="16"/>
-              </w:rPr>
-            </w:pPr>
-            <w:r>
-              <w:rPr>
-                <w:sz w:val="16"/>
-                <w:szCs w:val="16"/>
-              </w:rPr>
-              <w:t xml:space="preserve">shading</w:t>
-            </w:r>
-          </w:p>
-        </w:tc>
-        <w:tc>
-          <w:tcPr>
-            <w:tcW w:w="1231" w:type="dxa"/>
+            <w:tcW w:w="2455" w:type="dxa"/>
+          </w:tcPr>
+          <w:p>
+            <w:pPr>
+              <w:pStyle w:val="Compact"/>
+              <w:jc w:val="left"/>
+              <w:rPr>
+                <w:sz w:val="16"/>
+                <w:szCs w:val="16"/>
+              </w:rPr>
+            </w:pPr>
+            <w:r>
+              <w:rPr>
+                <w:sz w:val="16"/>
+                <w:szCs w:val="16"/>
+              </w:rPr>
+              <w:t xml:space="preserve">Topographic shading</w:t>
+            </w:r>
+          </w:p>
+        </w:tc>
+        <w:tc>
+          <w:tcPr>
+            <w:tcW w:w="995" w:type="dxa"/>
           </w:tcPr>
           <w:p>
             <w:pPr>
@@ -8937,7 +8937,7 @@
         </w:tc>
         <w:tc>
           <w:tcPr>
-            <w:tcW w:w="1067" w:type="dxa"/>
+            <w:tcW w:w="862" w:type="dxa"/>
           </w:tcPr>
           <w:p>
             <w:pPr>
@@ -8959,7 +8959,7 @@
         </w:tc>
         <w:tc>
           <w:tcPr>
-            <w:tcW w:w="1477" w:type="dxa"/>
+            <w:tcW w:w="1194" w:type="dxa"/>
           </w:tcPr>
           <w:p>
             <w:pPr>
@@ -8981,7 +8981,7 @@
         </w:tc>
         <w:tc>
           <w:tcPr>
-            <w:tcW w:w="820" w:type="dxa"/>
+            <w:tcW w:w="663" w:type="dxa"/>
           </w:tcPr>
           <w:p>
             <w:pPr>

</xml_diff>

<commit_message>
Commit the 16 September 2026 AFE submission work and the archived draft renders
Stages the Manuscript, Supporting Information, Tables and Cover Letter sources and Word files, the byte-verified copies of the submitted files under drafts, the APA style file, the render list and the Journal of Pest Science decision letter. The knitr cache of the archived draft is ignored because it holds files over 100 MB. Deletions of _hooks, _sections, _shared and _tools are not staged; those directories are missing on disk after the drive fault and stay in the repository until the disk is repaired.
</commit_message>
<xml_diff>
--- a/01.manuscript/Supporting Information.docx
+++ b/01.manuscript/Supporting Information.docx
@@ -2194,7 +2194,7 @@
         <w:t xml:space="preserve"> </w:t>
       </w:r>
       <w:r>
-        <w:t xml:space="preserve">Liston and Elder (2006)</w:t>
+        <w:t xml:space="preserve">Liston &amp; Elder (2006)</w:t>
       </w:r>
       <w:r>
         <w:t xml:space="preserve"> </w:t>
@@ -2242,7 +2242,7 @@
         <w:t xml:space="preserve"> </w:t>
       </w:r>
       <w:r>
-        <w:t xml:space="preserve">Liston and Elder (2006)</w:t>
+        <w:t xml:space="preserve">Liston &amp; Elder (2006)</w:t>
       </w:r>
       <w:r>
         <w:t xml:space="preserve">. Curvature</w:t>
@@ -2926,7 +2926,7 @@
         <w:pStyle w:val="FirstParagraph"/>
       </w:pPr>
       <w:r>
-        <w:t xml:space="preserve">Variable selection. Every candidate with its pathway, its univariate AUC, the stage at which it left, and for the survivors of the inflation stage the lasso coefficient at the chosen penalty. Protected marked the highest-ranked survivor of each pathway, which the penalty could not remove. AUC was the area under the receiver operating characteristic curve of the univariate fit, and the asterisks beside it marked the significance of that fit, * p ≤ 0.05, ** p ≤ 0.01, *** p ≤ 0.001, **** p ≤ 0.0001.</w:t>
+        <w:t xml:space="preserve">Variable selection. Every candidate with its pathway, its univariate AUC, the stage at which it left, and for the survivors of the inflation stage the lasso coefficient at the chosen penalty. Protected marked the highest-ranked survivor of each pathway, which the penalty could not remove. AUC was the area under the receiver operating characteristic curve of the univariate fit, and the asterisks beside it marked the significance of that fit, * P ≤ 0.05, ** P ≤ 0.01, *** P ≤ 0.001, **** P ≤ 0.0001.</w:t>
       </w:r>
     </w:p>
     <w:tbl>
@@ -9084,7 +9084,7 @@
         <w:t xml:space="preserve"> </w:t>
       </w:r>
       <w:r>
-        <w:t xml:space="preserve">Ainslie and Jackson (2010)</w:t>
+        <w:t xml:space="preserve">Ainslie &amp; Jackson (2010)</w:t>
       </w:r>
       <w:r>
         <w:t xml:space="preserve"> </w:t>
@@ -9098,7 +9098,7 @@
         <w:pStyle w:val="BodyText"/>
       </w:pPr>
       <w:r>
-        <w:t xml:space="preserve">The 16-day model was refitted under four definitions of the window (Table S4), every hour, the 12:00 to 17:00 hours the flight peak occupied, the 11:00 to 18:00 hours that fell inside the thermal limits on this landscape more than half the time, and only those hours whose observed temperature fell inside the 19 to 41 degrees C range itself. The stem-density interaction was negative under all four definitions and distinguishable from zero under three, at -0.049 over the full regime and -0.037 and -0.041 over the two clock windows, and fell to -0.011 (p = 0.173) when the hours were restricted to those inside the thermal limits, where the standing-volume interaction was instead the larger of the two at -0.040 (p &lt; 0.001). One of the two density terms therefore carried the interaction under every definition, but which one depended on how the window was drawn, so the mechanism did not rest on the choice while its expression through stems or through volume did.</w:t>
+        <w:t xml:space="preserve">The 16-day model was refitted under four definitions of the window (Table S4), every hour, the 12:00 to 17:00 hours the flight peak occupied, the 11:00 to 18:00 hours that fell inside the thermal limits on this landscape more than half the time, and only those hours whose observed temperature fell inside the 19 to 41 degrees C range itself. The stem-density interaction was negative under all four definitions and distinguishable from zero under three, at -0.049 over the full regime and -0.037 and -0.041 over the two clock windows, and fell to -0.011 (P = 0.173) when the hours were restricted to those inside the thermal limits, where the standing-volume interaction was instead the larger of the two at -0.040 (P &lt; 0.001). One of the two density terms therefore carried the interaction under every definition, but which one depended on how the window was drawn, so the mechanism did not rest on the choice while its expression through stems or through volume did.</w:t>
       </w:r>
     </w:p>
     <w:p>
@@ -9106,7 +9106,7 @@
         <w:pStyle w:val="BodyText"/>
       </w:pPr>
       <w:r>
-        <w:t xml:space="preserve">The 16-day model refitted under four definitions of the wind window. The epoch wind regime, every hour, was the definition used throughout the article. Coefficients were log-odds per standard deviation and AUC the area under the receiver operating characteristic curve. Significance was marked * p ≤ 0.05, ** p ≤ 0.01, *** p ≤ 0.001, **** p ≤ 0.0001. The thermal-limits row was fitted on fewer cell-epochs because two epochs had too few qualifying hours, so its row was not directly comparable with the other three.</w:t>
+        <w:t xml:space="preserve">The 16-day model refitted under four definitions of the wind window. The epoch wind regime, every hour, was the definition used throughout the article. Coefficients were log-odds per standard deviation and AUC the area under the receiver operating characteristic curve. Significance was marked * P ≤ 0.05, ** P ≤ 0.01, *** P ≤ 0.001, **** P ≤ 0.0001. The thermal-limits row was fitted on fewer cell-epochs because two epochs had too few qualifying hours, so its row was not directly comparable with the other three.</w:t>
       </w:r>
     </w:p>
     <w:tbl>
@@ -9828,7 +9828,33 @@
         <w:pStyle w:val="Bibliography"/>
       </w:pPr>
       <w:r>
-        <w:t xml:space="preserve">Ainslie B, Jackson PL (2010) Investigation into mountain pine beetle above-canopy dispersion using weather radar and an atmospheric dispersion model. Aerobiologia 27:51–65.</w:t>
+        <w:t xml:space="preserve">Ainslie, B., &amp; Jackson, P. L. (2010). Investigation into mountain pine beetle above-canopy dispersion using weather radar and an atmospheric dispersion model.</w:t>
+      </w:r>
+      <w:r>
+        <w:t xml:space="preserve"> </w:t>
+      </w:r>
+      <w:r>
+        <w:rPr>
+          <w:i/>
+          <w:iCs/>
+        </w:rPr>
+        <w:t xml:space="preserve">Aerobiologia</w:t>
+      </w:r>
+      <w:r>
+        <w:t xml:space="preserve">,</w:t>
+      </w:r>
+      <w:r>
+        <w:t xml:space="preserve"> </w:t>
+      </w:r>
+      <w:r>
+        <w:rPr>
+          <w:i/>
+          <w:iCs/>
+        </w:rPr>
+        <w:t xml:space="preserve">27</w:t>
+      </w:r>
+      <w:r>
+        <w:t xml:space="preserve">, 51–65.</w:t>
       </w:r>
       <w:r>
         <w:t xml:space="preserve"> </w:t>
@@ -9849,7 +9875,7 @@
         <w:pStyle w:val="Bibliography"/>
       </w:pPr>
       <w:r>
-        <w:t xml:space="preserve">Jackson PL, Straussfogel D, Lindgren BS, et al (2008) Radar observation and aerial capture of mountain pine beetle,</w:t>
+        <w:t xml:space="preserve">Jackson, P. L., Straussfogel, D., Lindgren, B. S., Mitchell, S., &amp; Murphy, B. (2008). Radar observation and aerial capture of mountain pine beetle,</w:t>
       </w:r>
       <w:r>
         <w:t xml:space="preserve"> </w:t>
@@ -9879,7 +9905,33 @@
         <w:t xml:space="preserve">Scolytidae</w:t>
       </w:r>
       <w:r>
-        <w:t xml:space="preserve">) in flight above the forest canopy. Canadian Journal of Forest Research 38:2313–2327.</w:t>
+        <w:t xml:space="preserve">) in flight above the forest canopy.</w:t>
+      </w:r>
+      <w:r>
+        <w:t xml:space="preserve"> </w:t>
+      </w:r>
+      <w:r>
+        <w:rPr>
+          <w:i/>
+          <w:iCs/>
+        </w:rPr>
+        <w:t xml:space="preserve">Canadian Journal of Forest Research</w:t>
+      </w:r>
+      <w:r>
+        <w:t xml:space="preserve">,</w:t>
+      </w:r>
+      <w:r>
+        <w:t xml:space="preserve"> </w:t>
+      </w:r>
+      <w:r>
+        <w:rPr>
+          <w:i/>
+          <w:iCs/>
+        </w:rPr>
+        <w:t xml:space="preserve">38</w:t>
+      </w:r>
+      <w:r>
+        <w:t xml:space="preserve">(8), 2313–2327.</w:t>
       </w:r>
       <w:r>
         <w:t xml:space="preserve"> </w:t>
@@ -9900,7 +9952,33 @@
         <w:pStyle w:val="Bibliography"/>
       </w:pPr>
       <w:r>
-        <w:t xml:space="preserve">Liston GE, Elder K (2006) A meteorological distribution system for high-resolution terrestrial modeling (MicroMet). Journal of Hydrometeorology 7:217–234.</w:t>
+        <w:t xml:space="preserve">Liston, G. E., &amp; Elder, K. (2006). A meteorological distribution system for high-resolution terrestrial modeling (MicroMet).</w:t>
+      </w:r>
+      <w:r>
+        <w:t xml:space="preserve"> </w:t>
+      </w:r>
+      <w:r>
+        <w:rPr>
+          <w:i/>
+          <w:iCs/>
+        </w:rPr>
+        <w:t xml:space="preserve">Journal of Hydrometeorology</w:t>
+      </w:r>
+      <w:r>
+        <w:t xml:space="preserve">,</w:t>
+      </w:r>
+      <w:r>
+        <w:t xml:space="preserve"> </w:t>
+      </w:r>
+      <w:r>
+        <w:rPr>
+          <w:i/>
+          <w:iCs/>
+        </w:rPr>
+        <w:t xml:space="preserve">7</w:t>
+      </w:r>
+      <w:r>
+        <w:t xml:space="preserve">(2), 217–234.</w:t>
       </w:r>
       <w:r>
         <w:t xml:space="preserve"> </w:t>

</xml_diff>

<commit_message>
Rebuild the Introduction and Discussion on the reviewed literature for the AFE resubmission
Run the review protocol over three strands and a chase from eight seeds, 1,257 records screened, 198 retained and 34 read in full, with the synthesis and the attribute table for every fitted variable. Rewrite the Introduction inside the landscape modelling, thinning and dispersal literature and the Discussion in five sections that set each finding against prior work. Port the title page and three Methods paragraphs from the submitted Word file, add the review sentences with counts read by code, move the flight-window figure and the landform table to the Supporting Information, keep the review code out of the Word file, add 49 Crossref entries to the bibliography, and rewrite the cover letter for the resubmission. Third render measures 7,813 words on the journal's inclusive rule against 8,000.
</commit_message>
<xml_diff>
--- a/01.manuscript/Supporting Information.docx
+++ b/01.manuscript/Supporting Information.docx
@@ -9812,7 +9812,897 @@
       </w:tr>
     </w:tbl>
     <w:bookmarkEnd w:id="28"/>
-    <w:bookmarkStart w:id="36" w:name="references"/>
+    <w:bookmarkStart w:id="29" w:name="table-s5"/>
+    <w:p>
+      <w:pPr>
+        <w:pStyle w:val="Heading1"/>
+      </w:pPr>
+      <w:r>
+        <w:t xml:space="preserve">Table S5</w:t>
+      </w:r>
+    </w:p>
+    <w:p>
+      <w:pPr>
+        <w:pStyle w:val="FirstParagraph"/>
+      </w:pPr>
+      <w:r>
+        <w:t xml:space="preserve">Geomorphon landform classes in the full annual model M3, as coefficients against the reference class, slope, the most common class on the perimeter. Cells was the number of perimeter cells in each class and Attacked the share of those cells classed moderate-to-high over all years. Flat and pit did not occur on the perimeter, and shoulder, 16 cells with no attack, was merged into ridge. Significance was marked * P ≤ 0.05, ** P ≤ 0.01, *** P ≤ 0.001, **** P ≤ 0.0001.</w:t>
+      </w:r>
+    </w:p>
+    <w:tbl>
+      <w:tblPr>
+        <w:tblStyle w:val="Table"/>
+        <w:tblLook w:firstRow="1" w:lastRow="0" w:firstColumn="0" w:lastColumn="0" w:noHBand="0" w:noVBand="0" w:val="0020"/>
+        <w:tblW w:w="9354" w:type="dxa"/>
+        <w:tblLayout w:type="fixed"/>
+      </w:tblPr>
+      <w:tblGrid>
+        <w:gridCol w:w="1871"/>
+        <w:gridCol w:w="1871"/>
+        <w:gridCol w:w="1871"/>
+        <w:gridCol w:w="1871"/>
+        <w:gridCol w:w="1870"/>
+      </w:tblGrid>
+      <w:tr>
+        <w:trPr>
+          <w:tblHeader w:val="on"/>
+          <w:trHeight w:val="624" w:hRule="exact"/>
+        </w:trPr>
+        <w:tc>
+          <w:tcPr>
+            <w:tcW w:w="1871" w:type="dxa"/>
+          </w:tcPr>
+          <w:p>
+            <w:pPr>
+              <w:pStyle w:val="Compact"/>
+              <w:jc w:val="left"/>
+              <w:rPr>
+                <w:sz w:val="16"/>
+                <w:szCs w:val="16"/>
+              </w:rPr>
+            </w:pPr>
+            <w:r>
+              <w:rPr>
+                <w:sz w:val="16"/>
+                <w:szCs w:val="16"/>
+              </w:rPr>
+              <w:t xml:space="preserve">Class</w:t>
+            </w:r>
+          </w:p>
+        </w:tc>
+        <w:tc>
+          <w:tcPr>
+            <w:tcW w:w="1871" w:type="dxa"/>
+          </w:tcPr>
+          <w:p>
+            <w:pPr>
+              <w:pStyle w:val="Compact"/>
+              <w:jc w:val="left"/>
+              <w:rPr>
+                <w:sz w:val="16"/>
+                <w:szCs w:val="16"/>
+              </w:rPr>
+            </w:pPr>
+            <w:r>
+              <w:rPr>
+                <w:sz w:val="16"/>
+                <w:szCs w:val="16"/>
+              </w:rPr>
+              <w:t xml:space="preserve">Cells</w:t>
+            </w:r>
+          </w:p>
+        </w:tc>
+        <w:tc>
+          <w:tcPr>
+            <w:tcW w:w="1871" w:type="dxa"/>
+          </w:tcPr>
+          <w:p>
+            <w:pPr>
+              <w:pStyle w:val="Compact"/>
+              <w:jc w:val="left"/>
+              <w:rPr>
+                <w:sz w:val="16"/>
+                <w:szCs w:val="16"/>
+              </w:rPr>
+            </w:pPr>
+            <w:r>
+              <w:rPr>
+                <w:sz w:val="16"/>
+                <w:szCs w:val="16"/>
+              </w:rPr>
+              <w:t xml:space="preserve">Attacked (%)</w:t>
+            </w:r>
+          </w:p>
+        </w:tc>
+        <w:tc>
+          <w:tcPr>
+            <w:tcW w:w="1871" w:type="dxa"/>
+          </w:tcPr>
+          <w:p>
+            <w:pPr>
+              <w:pStyle w:val="Compact"/>
+              <w:jc w:val="left"/>
+              <w:rPr>
+                <w:sz w:val="16"/>
+                <w:szCs w:val="16"/>
+              </w:rPr>
+            </w:pPr>
+            <w:r>
+              <w:rPr>
+                <w:sz w:val="16"/>
+                <w:szCs w:val="16"/>
+              </w:rPr>
+              <w:t xml:space="preserve">Beta</w:t>
+            </w:r>
+          </w:p>
+        </w:tc>
+        <w:tc>
+          <w:tcPr>
+            <w:tcW w:w="1870" w:type="dxa"/>
+          </w:tcPr>
+          <w:p>
+            <w:pPr>
+              <w:pStyle w:val="Compact"/>
+              <w:jc w:val="left"/>
+              <w:rPr>
+                <w:sz w:val="16"/>
+                <w:szCs w:val="16"/>
+              </w:rPr>
+            </w:pPr>
+            <w:r>
+              <w:rPr>
+                <w:sz w:val="16"/>
+                <w:szCs w:val="16"/>
+              </w:rPr>
+              <w:t xml:space="preserve">SE</w:t>
+            </w:r>
+          </w:p>
+        </w:tc>
+      </w:tr>
+      <w:tr>
+        <w:trPr>
+          <w:trHeight w:val="340" w:hRule="exact"/>
+        </w:trPr>
+        <w:tc>
+          <w:tcPr>
+            <w:tcW w:w="1871" w:type="dxa"/>
+          </w:tcPr>
+          <w:p>
+            <w:pPr>
+              <w:pStyle w:val="Compact"/>
+              <w:jc w:val="left"/>
+              <w:rPr>
+                <w:sz w:val="16"/>
+                <w:szCs w:val="16"/>
+              </w:rPr>
+            </w:pPr>
+            <w:r>
+              <w:rPr>
+                <w:sz w:val="16"/>
+                <w:szCs w:val="16"/>
+              </w:rPr>
+              <w:t xml:space="preserve">slope (reference)</w:t>
+            </w:r>
+          </w:p>
+        </w:tc>
+        <w:tc>
+          <w:tcPr>
+            <w:tcW w:w="1871" w:type="dxa"/>
+          </w:tcPr>
+          <w:p>
+            <w:pPr>
+              <w:pStyle w:val="Compact"/>
+              <w:jc w:val="left"/>
+              <w:rPr>
+                <w:sz w:val="16"/>
+                <w:szCs w:val="16"/>
+              </w:rPr>
+            </w:pPr>
+            <w:r>
+              <w:rPr>
+                <w:sz w:val="16"/>
+                <w:szCs w:val="16"/>
+              </w:rPr>
+              <w:t xml:space="preserve">72,262</w:t>
+            </w:r>
+          </w:p>
+        </w:tc>
+        <w:tc>
+          <w:tcPr>
+            <w:tcW w:w="1871" w:type="dxa"/>
+          </w:tcPr>
+          <w:p>
+            <w:pPr>
+              <w:pStyle w:val="Compact"/>
+              <w:jc w:val="left"/>
+              <w:rPr>
+                <w:sz w:val="16"/>
+                <w:szCs w:val="16"/>
+              </w:rPr>
+            </w:pPr>
+            <w:r>
+              <w:rPr>
+                <w:sz w:val="16"/>
+                <w:szCs w:val="16"/>
+              </w:rPr>
+              <w:t xml:space="preserve">9.6</w:t>
+            </w:r>
+          </w:p>
+        </w:tc>
+        <w:tc>
+          <w:tcPr>
+            <w:tcW w:w="1871" w:type="dxa"/>
+          </w:tcPr>
+          <w:p>
+            <w:pPr>
+              <w:pStyle w:val="Compact"/>
+              <w:jc w:val="left"/>
+              <w:rPr>
+                <w:sz w:val="16"/>
+                <w:szCs w:val="16"/>
+              </w:rPr>
+            </w:pPr>
+          </w:p>
+        </w:tc>
+        <w:tc>
+          <w:tcPr>
+            <w:tcW w:w="1870" w:type="dxa"/>
+          </w:tcPr>
+          <w:p>
+            <w:pPr>
+              <w:pStyle w:val="Compact"/>
+              <w:jc w:val="left"/>
+              <w:rPr>
+                <w:sz w:val="16"/>
+                <w:szCs w:val="16"/>
+              </w:rPr>
+            </w:pPr>
+          </w:p>
+        </w:tc>
+      </w:tr>
+      <w:tr>
+        <w:trPr>
+          <w:trHeight w:val="340" w:hRule="exact"/>
+        </w:trPr>
+        <w:tc>
+          <w:tcPr>
+            <w:tcW w:w="1871" w:type="dxa"/>
+          </w:tcPr>
+          <w:p>
+            <w:pPr>
+              <w:pStyle w:val="Compact"/>
+              <w:jc w:val="left"/>
+              <w:rPr>
+                <w:sz w:val="16"/>
+                <w:szCs w:val="16"/>
+              </w:rPr>
+            </w:pPr>
+            <w:r>
+              <w:rPr>
+                <w:sz w:val="16"/>
+                <w:szCs w:val="16"/>
+              </w:rPr>
+              <w:t xml:space="preserve">spur</w:t>
+            </w:r>
+          </w:p>
+        </w:tc>
+        <w:tc>
+          <w:tcPr>
+            <w:tcW w:w="1871" w:type="dxa"/>
+          </w:tcPr>
+          <w:p>
+            <w:pPr>
+              <w:pStyle w:val="Compact"/>
+              <w:jc w:val="left"/>
+              <w:rPr>
+                <w:sz w:val="16"/>
+                <w:szCs w:val="16"/>
+              </w:rPr>
+            </w:pPr>
+            <w:r>
+              <w:rPr>
+                <w:sz w:val="16"/>
+                <w:szCs w:val="16"/>
+              </w:rPr>
+              <w:t xml:space="preserve">22,050</w:t>
+            </w:r>
+          </w:p>
+        </w:tc>
+        <w:tc>
+          <w:tcPr>
+            <w:tcW w:w="1871" w:type="dxa"/>
+          </w:tcPr>
+          <w:p>
+            <w:pPr>
+              <w:pStyle w:val="Compact"/>
+              <w:jc w:val="left"/>
+              <w:rPr>
+                <w:sz w:val="16"/>
+                <w:szCs w:val="16"/>
+              </w:rPr>
+            </w:pPr>
+            <w:r>
+              <w:rPr>
+                <w:sz w:val="16"/>
+                <w:szCs w:val="16"/>
+              </w:rPr>
+              <w:t xml:space="preserve">12.6</w:t>
+            </w:r>
+          </w:p>
+        </w:tc>
+        <w:tc>
+          <w:tcPr>
+            <w:tcW w:w="1871" w:type="dxa"/>
+          </w:tcPr>
+          <w:p>
+            <w:pPr>
+              <w:pStyle w:val="Compact"/>
+              <w:jc w:val="left"/>
+              <w:rPr>
+                <w:sz w:val="16"/>
+                <w:szCs w:val="16"/>
+              </w:rPr>
+            </w:pPr>
+            <w:r>
+              <w:rPr>
+                <w:sz w:val="16"/>
+                <w:szCs w:val="16"/>
+              </w:rPr>
+              <w:t xml:space="preserve">-0.075*</w:t>
+            </w:r>
+          </w:p>
+        </w:tc>
+        <w:tc>
+          <w:tcPr>
+            <w:tcW w:w="1870" w:type="dxa"/>
+          </w:tcPr>
+          <w:p>
+            <w:pPr>
+              <w:pStyle w:val="Compact"/>
+              <w:jc w:val="left"/>
+              <w:rPr>
+                <w:sz w:val="16"/>
+                <w:szCs w:val="16"/>
+              </w:rPr>
+            </w:pPr>
+            <w:r>
+              <w:rPr>
+                <w:sz w:val="16"/>
+                <w:szCs w:val="16"/>
+              </w:rPr>
+              <w:t xml:space="preserve">0.035</w:t>
+            </w:r>
+          </w:p>
+        </w:tc>
+      </w:tr>
+      <w:tr>
+        <w:trPr>
+          <w:trHeight w:val="340" w:hRule="exact"/>
+        </w:trPr>
+        <w:tc>
+          <w:tcPr>
+            <w:tcW w:w="1871" w:type="dxa"/>
+          </w:tcPr>
+          <w:p>
+            <w:pPr>
+              <w:pStyle w:val="Compact"/>
+              <w:jc w:val="left"/>
+              <w:rPr>
+                <w:sz w:val="16"/>
+                <w:szCs w:val="16"/>
+              </w:rPr>
+            </w:pPr>
+            <w:r>
+              <w:rPr>
+                <w:sz w:val="16"/>
+                <w:szCs w:val="16"/>
+              </w:rPr>
+              <w:t xml:space="preserve">hollow</w:t>
+            </w:r>
+          </w:p>
+        </w:tc>
+        <w:tc>
+          <w:tcPr>
+            <w:tcW w:w="1871" w:type="dxa"/>
+          </w:tcPr>
+          <w:p>
+            <w:pPr>
+              <w:pStyle w:val="Compact"/>
+              <w:jc w:val="left"/>
+              <w:rPr>
+                <w:sz w:val="16"/>
+                <w:szCs w:val="16"/>
+              </w:rPr>
+            </w:pPr>
+            <w:r>
+              <w:rPr>
+                <w:sz w:val="16"/>
+                <w:szCs w:val="16"/>
+              </w:rPr>
+              <w:t xml:space="preserve">12,988</w:t>
+            </w:r>
+          </w:p>
+        </w:tc>
+        <w:tc>
+          <w:tcPr>
+            <w:tcW w:w="1871" w:type="dxa"/>
+          </w:tcPr>
+          <w:p>
+            <w:pPr>
+              <w:pStyle w:val="Compact"/>
+              <w:jc w:val="left"/>
+              <w:rPr>
+                <w:sz w:val="16"/>
+                <w:szCs w:val="16"/>
+              </w:rPr>
+            </w:pPr>
+            <w:r>
+              <w:rPr>
+                <w:sz w:val="16"/>
+                <w:szCs w:val="16"/>
+              </w:rPr>
+              <w:t xml:space="preserve">6.0</w:t>
+            </w:r>
+          </w:p>
+        </w:tc>
+        <w:tc>
+          <w:tcPr>
+            <w:tcW w:w="1871" w:type="dxa"/>
+          </w:tcPr>
+          <w:p>
+            <w:pPr>
+              <w:pStyle w:val="Compact"/>
+              <w:jc w:val="left"/>
+              <w:rPr>
+                <w:sz w:val="16"/>
+                <w:szCs w:val="16"/>
+              </w:rPr>
+            </w:pPr>
+            <w:r>
+              <w:rPr>
+                <w:sz w:val="16"/>
+                <w:szCs w:val="16"/>
+              </w:rPr>
+              <w:t xml:space="preserve">-0.091</w:t>
+            </w:r>
+          </w:p>
+        </w:tc>
+        <w:tc>
+          <w:tcPr>
+            <w:tcW w:w="1870" w:type="dxa"/>
+          </w:tcPr>
+          <w:p>
+            <w:pPr>
+              <w:pStyle w:val="Compact"/>
+              <w:jc w:val="left"/>
+              <w:rPr>
+                <w:sz w:val="16"/>
+                <w:szCs w:val="16"/>
+              </w:rPr>
+            </w:pPr>
+            <w:r>
+              <w:rPr>
+                <w:sz w:val="16"/>
+                <w:szCs w:val="16"/>
+              </w:rPr>
+              <w:t xml:space="preserve">0.053</w:t>
+            </w:r>
+          </w:p>
+        </w:tc>
+      </w:tr>
+      <w:tr>
+        <w:trPr>
+          <w:trHeight w:val="340" w:hRule="exact"/>
+        </w:trPr>
+        <w:tc>
+          <w:tcPr>
+            <w:tcW w:w="1871" w:type="dxa"/>
+          </w:tcPr>
+          <w:p>
+            <w:pPr>
+              <w:pStyle w:val="Compact"/>
+              <w:jc w:val="left"/>
+              <w:rPr>
+                <w:sz w:val="16"/>
+                <w:szCs w:val="16"/>
+              </w:rPr>
+            </w:pPr>
+            <w:r>
+              <w:rPr>
+                <w:sz w:val="16"/>
+                <w:szCs w:val="16"/>
+              </w:rPr>
+              <w:t xml:space="preserve">valley</w:t>
+            </w:r>
+          </w:p>
+        </w:tc>
+        <w:tc>
+          <w:tcPr>
+            <w:tcW w:w="1871" w:type="dxa"/>
+          </w:tcPr>
+          <w:p>
+            <w:pPr>
+              <w:pStyle w:val="Compact"/>
+              <w:jc w:val="left"/>
+              <w:rPr>
+                <w:sz w:val="16"/>
+                <w:szCs w:val="16"/>
+              </w:rPr>
+            </w:pPr>
+            <w:r>
+              <w:rPr>
+                <w:sz w:val="16"/>
+                <w:szCs w:val="16"/>
+              </w:rPr>
+              <w:t xml:space="preserve">2,963</w:t>
+            </w:r>
+          </w:p>
+        </w:tc>
+        <w:tc>
+          <w:tcPr>
+            <w:tcW w:w="1871" w:type="dxa"/>
+          </w:tcPr>
+          <w:p>
+            <w:pPr>
+              <w:pStyle w:val="Compact"/>
+              <w:jc w:val="left"/>
+              <w:rPr>
+                <w:sz w:val="16"/>
+                <w:szCs w:val="16"/>
+              </w:rPr>
+            </w:pPr>
+            <w:r>
+              <w:rPr>
+                <w:sz w:val="16"/>
+                <w:szCs w:val="16"/>
+              </w:rPr>
+              <w:t xml:space="preserve">3.8</w:t>
+            </w:r>
+          </w:p>
+        </w:tc>
+        <w:tc>
+          <w:tcPr>
+            <w:tcW w:w="1871" w:type="dxa"/>
+          </w:tcPr>
+          <w:p>
+            <w:pPr>
+              <w:pStyle w:val="Compact"/>
+              <w:jc w:val="left"/>
+              <w:rPr>
+                <w:sz w:val="16"/>
+                <w:szCs w:val="16"/>
+              </w:rPr>
+            </w:pPr>
+            <w:r>
+              <w:rPr>
+                <w:sz w:val="16"/>
+                <w:szCs w:val="16"/>
+              </w:rPr>
+              <w:t xml:space="preserve">-0.676****</w:t>
+            </w:r>
+          </w:p>
+        </w:tc>
+        <w:tc>
+          <w:tcPr>
+            <w:tcW w:w="1870" w:type="dxa"/>
+          </w:tcPr>
+          <w:p>
+            <w:pPr>
+              <w:pStyle w:val="Compact"/>
+              <w:jc w:val="left"/>
+              <w:rPr>
+                <w:sz w:val="16"/>
+                <w:szCs w:val="16"/>
+              </w:rPr>
+            </w:pPr>
+            <w:r>
+              <w:rPr>
+                <w:sz w:val="16"/>
+                <w:szCs w:val="16"/>
+              </w:rPr>
+              <w:t xml:space="preserve">0.121</w:t>
+            </w:r>
+          </w:p>
+        </w:tc>
+      </w:tr>
+      <w:tr>
+        <w:trPr>
+          <w:trHeight w:val="340" w:hRule="exact"/>
+        </w:trPr>
+        <w:tc>
+          <w:tcPr>
+            <w:tcW w:w="1871" w:type="dxa"/>
+          </w:tcPr>
+          <w:p>
+            <w:pPr>
+              <w:pStyle w:val="Compact"/>
+              <w:jc w:val="left"/>
+              <w:rPr>
+                <w:sz w:val="16"/>
+                <w:szCs w:val="16"/>
+              </w:rPr>
+            </w:pPr>
+            <w:r>
+              <w:rPr>
+                <w:sz w:val="16"/>
+                <w:szCs w:val="16"/>
+              </w:rPr>
+              <w:t xml:space="preserve">ridge#</w:t>
+            </w:r>
+          </w:p>
+        </w:tc>
+        <w:tc>
+          <w:tcPr>
+            <w:tcW w:w="1871" w:type="dxa"/>
+          </w:tcPr>
+          <w:p>
+            <w:pPr>
+              <w:pStyle w:val="Compact"/>
+              <w:jc w:val="left"/>
+              <w:rPr>
+                <w:sz w:val="16"/>
+                <w:szCs w:val="16"/>
+              </w:rPr>
+            </w:pPr>
+            <w:r>
+              <w:rPr>
+                <w:sz w:val="16"/>
+                <w:szCs w:val="16"/>
+              </w:rPr>
+              <w:t xml:space="preserve">1,276</w:t>
+            </w:r>
+          </w:p>
+        </w:tc>
+        <w:tc>
+          <w:tcPr>
+            <w:tcW w:w="1871" w:type="dxa"/>
+          </w:tcPr>
+          <w:p>
+            <w:pPr>
+              <w:pStyle w:val="Compact"/>
+              <w:jc w:val="left"/>
+              <w:rPr>
+                <w:sz w:val="16"/>
+                <w:szCs w:val="16"/>
+              </w:rPr>
+            </w:pPr>
+            <w:r>
+              <w:rPr>
+                <w:sz w:val="16"/>
+                <w:szCs w:val="16"/>
+              </w:rPr>
+              <w:t xml:space="preserve">11.0</w:t>
+            </w:r>
+          </w:p>
+        </w:tc>
+        <w:tc>
+          <w:tcPr>
+            <w:tcW w:w="1871" w:type="dxa"/>
+          </w:tcPr>
+          <w:p>
+            <w:pPr>
+              <w:pStyle w:val="Compact"/>
+              <w:jc w:val="left"/>
+              <w:rPr>
+                <w:sz w:val="16"/>
+                <w:szCs w:val="16"/>
+              </w:rPr>
+            </w:pPr>
+            <w:r>
+              <w:rPr>
+                <w:sz w:val="16"/>
+                <w:szCs w:val="16"/>
+              </w:rPr>
+              <w:t xml:space="preserve">-1.160****</w:t>
+            </w:r>
+          </w:p>
+        </w:tc>
+        <w:tc>
+          <w:tcPr>
+            <w:tcW w:w="1870" w:type="dxa"/>
+          </w:tcPr>
+          <w:p>
+            <w:pPr>
+              <w:pStyle w:val="Compact"/>
+              <w:jc w:val="left"/>
+              <w:rPr>
+                <w:sz w:val="16"/>
+                <w:szCs w:val="16"/>
+              </w:rPr>
+            </w:pPr>
+            <w:r>
+              <w:rPr>
+                <w:sz w:val="16"/>
+                <w:szCs w:val="16"/>
+              </w:rPr>
+              <w:t xml:space="preserve">0.119</w:t>
+            </w:r>
+          </w:p>
+        </w:tc>
+      </w:tr>
+      <w:tr>
+        <w:trPr>
+          <w:trHeight w:val="340" w:hRule="exact"/>
+        </w:trPr>
+        <w:tc>
+          <w:tcPr>
+            <w:tcW w:w="1871" w:type="dxa"/>
+          </w:tcPr>
+          <w:p>
+            <w:pPr>
+              <w:pStyle w:val="Compact"/>
+              <w:jc w:val="left"/>
+              <w:rPr>
+                <w:sz w:val="16"/>
+                <w:szCs w:val="16"/>
+              </w:rPr>
+            </w:pPr>
+            <w:r>
+              <w:rPr>
+                <w:sz w:val="16"/>
+                <w:szCs w:val="16"/>
+              </w:rPr>
+              <w:t xml:space="preserve">peak</w:t>
+            </w:r>
+          </w:p>
+        </w:tc>
+        <w:tc>
+          <w:tcPr>
+            <w:tcW w:w="1871" w:type="dxa"/>
+          </w:tcPr>
+          <w:p>
+            <w:pPr>
+              <w:pStyle w:val="Compact"/>
+              <w:jc w:val="left"/>
+              <w:rPr>
+                <w:sz w:val="16"/>
+                <w:szCs w:val="16"/>
+              </w:rPr>
+            </w:pPr>
+            <w:r>
+              <w:rPr>
+                <w:sz w:val="16"/>
+                <w:szCs w:val="16"/>
+              </w:rPr>
+              <w:t xml:space="preserve">168</w:t>
+            </w:r>
+          </w:p>
+        </w:tc>
+        <w:tc>
+          <w:tcPr>
+            <w:tcW w:w="1871" w:type="dxa"/>
+          </w:tcPr>
+          <w:p>
+            <w:pPr>
+              <w:pStyle w:val="Compact"/>
+              <w:jc w:val="left"/>
+              <w:rPr>
+                <w:sz w:val="16"/>
+                <w:szCs w:val="16"/>
+              </w:rPr>
+            </w:pPr>
+            <w:r>
+              <w:rPr>
+                <w:sz w:val="16"/>
+                <w:szCs w:val="16"/>
+              </w:rPr>
+              <w:t xml:space="preserve">22.6</w:t>
+            </w:r>
+          </w:p>
+        </w:tc>
+        <w:tc>
+          <w:tcPr>
+            <w:tcW w:w="1871" w:type="dxa"/>
+          </w:tcPr>
+          <w:p>
+            <w:pPr>
+              <w:pStyle w:val="Compact"/>
+              <w:jc w:val="left"/>
+              <w:rPr>
+                <w:sz w:val="16"/>
+                <w:szCs w:val="16"/>
+              </w:rPr>
+            </w:pPr>
+            <w:r>
+              <w:rPr>
+                <w:sz w:val="16"/>
+                <w:szCs w:val="16"/>
+              </w:rPr>
+              <w:t xml:space="preserve">-0.523*</w:t>
+            </w:r>
+          </w:p>
+        </w:tc>
+        <w:tc>
+          <w:tcPr>
+            <w:tcW w:w="1870" w:type="dxa"/>
+          </w:tcPr>
+          <w:p>
+            <w:pPr>
+              <w:pStyle w:val="Compact"/>
+              <w:jc w:val="left"/>
+              <w:rPr>
+                <w:sz w:val="16"/>
+                <w:szCs w:val="16"/>
+              </w:rPr>
+            </w:pPr>
+            <w:r>
+              <w:rPr>
+                <w:sz w:val="16"/>
+                <w:szCs w:val="16"/>
+              </w:rPr>
+              <w:t xml:space="preserve">0.227</w:t>
+            </w:r>
+          </w:p>
+        </w:tc>
+      </w:tr>
+    </w:tbl>
+    <w:bookmarkEnd w:id="29"/>
+    <w:bookmarkStart w:id="33" w:name="figure-s1"/>
+    <w:p>
+      <w:pPr>
+        <w:pStyle w:val="Heading1"/>
+      </w:pPr>
+      <w:r>
+        <w:t xml:space="preserve">Figure S1</w:t>
+      </w:r>
+    </w:p>
+    <w:p>
+      <w:pPr>
+        <w:pStyle w:val="FirstParagraph"/>
+      </w:pPr>
+      <w:r>
+        <w:t xml:space="preserve">The flight window against the landscape’s own climate, from hourly Environment and Climate Change Canada station records for May to September of the nine study years. The shaded band marked the window, 1 July to 15 August, taken from the bionomics and not fitted to these data. (a) Mean afternoon temperature by day of year, with the 19 to 41 degrees C flight range and the 22 to 32 degrees C peak band marked. (b) The share of afternoon hours inside the flight range, day by day. (c) Mean temperature and the share of all hours inside the flight range, by hour, with the 12:00 to 17:00 restriction shaded. (d) Mean wind speed by hour on the same axis, showing that the hours in which the beetle could fly were also the windiest of the day.</w:t>
+      </w:r>
+    </w:p>
+    <w:p>
+      <w:pPr>
+        <w:pStyle w:val="BodyText"/>
+      </w:pPr>
+      <w:r>
+        <w:drawing>
+          <wp:inline>
+            <wp:extent cx="5943600" cy="4913375"/>
+            <wp:effectExtent b="0" l="0" r="0" t="0"/>
+            <wp:docPr descr="" title="" id="31" name="Picture"/>
+            <a:graphic>
+              <a:graphicData uri="http://schemas.openxmlformats.org/drawingml/2006/picture">
+                <pic:pic>
+                  <pic:nvPicPr>
+                    <pic:cNvPr descr="../03.outputs/PNG/FigS1.png" id="32" name="Picture"/>
+                    <pic:cNvPicPr>
+                      <a:picLocks noChangeArrowheads="1" noChangeAspect="1"/>
+                    </pic:cNvPicPr>
+                  </pic:nvPicPr>
+                  <pic:blipFill>
+                    <a:blip r:embed="rId30"/>
+                    <a:stretch>
+                      <a:fillRect/>
+                    </a:stretch>
+                  </pic:blipFill>
+                  <pic:spPr bwMode="auto">
+                    <a:xfrm>
+                      <a:off x="0" y="0"/>
+                      <a:ext cx="5943600" cy="4913375"/>
+                    </a:xfrm>
+                    <a:prstGeom prst="rect">
+                      <a:avLst/>
+                    </a:prstGeom>
+                    <a:noFill/>
+                    <a:ln w="9525">
+                      <a:noFill/>
+                      <a:headEnd/>
+                      <a:tailEnd/>
+                    </a:ln>
+                  </pic:spPr>
+                </pic:pic>
+              </a:graphicData>
+            </a:graphic>
+          </wp:inline>
+        </w:drawing>
+      </w:r>
+    </w:p>
+    <w:bookmarkEnd w:id="33"/>
+    <w:bookmarkStart w:id="41" w:name="references"/>
     <w:p>
       <w:pPr>
         <w:pStyle w:val="Heading1"/>
@@ -9821,8 +10711,8 @@
         <w:t xml:space="preserve">References</w:t>
       </w:r>
     </w:p>
-    <w:bookmarkStart w:id="35" w:name="refs"/>
-    <w:bookmarkStart w:id="30" w:name="ref-ainslie2010"/>
+    <w:bookmarkStart w:id="40" w:name="refs"/>
+    <w:bookmarkStart w:id="35" w:name="ref-ainslie2010"/>
     <w:p>
       <w:pPr>
         <w:pStyle w:val="Bibliography"/>
@@ -9859,7 +10749,7 @@
       <w:r>
         <w:t xml:space="preserve"> </w:t>
       </w:r>
-      <w:hyperlink r:id="rId29">
+      <w:hyperlink r:id="rId34">
         <w:r>
           <w:rPr>
             <w:rStyle w:val="Hyperlink"/>
@@ -9868,8 +10758,8 @@
         </w:r>
       </w:hyperlink>
     </w:p>
-    <w:bookmarkEnd w:id="30"/>
-    <w:bookmarkStart w:id="32" w:name="ref-jackson2008"/>
+    <w:bookmarkEnd w:id="35"/>
+    <w:bookmarkStart w:id="37" w:name="ref-jackson2008"/>
     <w:p>
       <w:pPr>
         <w:pStyle w:val="Bibliography"/>
@@ -9936,7 +10826,7 @@
       <w:r>
         <w:t xml:space="preserve"> </w:t>
       </w:r>
-      <w:hyperlink r:id="rId31">
+      <w:hyperlink r:id="rId36">
         <w:r>
           <w:rPr>
             <w:rStyle w:val="Hyperlink"/>
@@ -9945,8 +10835,8 @@
         </w:r>
       </w:hyperlink>
     </w:p>
-    <w:bookmarkEnd w:id="32"/>
-    <w:bookmarkStart w:id="34" w:name="ref-liston2006"/>
+    <w:bookmarkEnd w:id="37"/>
+    <w:bookmarkStart w:id="39" w:name="ref-liston2006"/>
     <w:p>
       <w:pPr>
         <w:pStyle w:val="Bibliography"/>
@@ -9983,7 +10873,7 @@
       <w:r>
         <w:t xml:space="preserve"> </w:t>
       </w:r>
-      <w:hyperlink r:id="rId33">
+      <w:hyperlink r:id="rId38">
         <w:r>
           <w:rPr>
             <w:rStyle w:val="Hyperlink"/>
@@ -9992,9 +10882,9 @@
         </w:r>
       </w:hyperlink>
     </w:p>
-    <w:bookmarkEnd w:id="34"/>
-    <w:bookmarkEnd w:id="35"/>
-    <w:bookmarkEnd w:id="36"/>
+    <w:bookmarkEnd w:id="39"/>
+    <w:bookmarkEnd w:id="40"/>
+    <w:bookmarkEnd w:id="41"/>
     <w:sectPr>
       <w:footerReference r:id="rId10" w:type="default"/>
       <w:footerReference r:id="rId9" w:type="first"/>

</xml_diff>